<commit_message>
Strengthen adaptive VSTEP learning loop
</commit_message>
<xml_diff>
--- a/docs/Bao-cao-ban-giao-May-VSTEP.docx
+++ b/docs/Bao-cao-ban-giao-May-VSTEP.docx
@@ -168,7 +168,7 @@
                 <w:color w:val="C93B72"/>
                 <w:sz w:val="18"/>
               </w:rPr>
-              <w:t>Phiên bản</w:t>
+              <w:t>Mốc đánh giá</w:t>
             </w:r>
           </w:p>
         </w:tc>
@@ -193,7 +193,7 @@
                 <w:color w:val="211D20"/>
                 <w:sz w:val="18"/>
               </w:rPr>
-              <w:t>ed9007fe033a8c25086a81b732c25444d9b43f78</w:t>
+              <w:t>9f4d8ea + vòng cải tiến learning loop 10/09/2026</w:t>
             </w:r>
           </w:p>
         </w:tc>
@@ -388,7 +388,7 @@
           <w:color w:val="211D20"/>
           <w:sz w:val="22"/>
         </w:rPr>
-        <w:t>Bản code hiện đủ để sử dụng cá nhân trên local, Supabase thật đã kết nối và kiểm thử, toàn bộ pipeline kiểm tra đang đạt. Các điều kiện còn thiếu để gọi là production hoàn chỉnh là URL HTTPS, nghiệm thu thiết bị thật, thử đồng bộ hai thiết bị và thẩm định học liệu bởi giáo viên VSTEP.</w:t>
+        <w:t>Bản code hiện đủ để Gùa pilot hằng ngày trên local, Supabase thật đã kết nối và kiểm thử, toàn bộ pipeline kiểm tra đang đạt. Daily Mission đã giải thích lý do chọn bài và ưu tiên lỗi đến hạn hoặc sai với mức tự tin cao. Các điều kiện còn thiếu để gọi là production hoàn chỉnh là URL HTTPS, nghiệm thu thiết bị thật, thử đồng bộ hai thiết bị và thẩm định học liệu bởi giáo viên VSTEP.</w:t>
       </w:r>
     </w:p>
     <w:p>
@@ -575,23 +575,17 @@
           <w:color w:val="211D20"/>
           <w:sz w:val="20"/>
         </w:rPr>
-        <w:t xml:space="preserve">Mây hiện là một ứng dụng luyện VSTEP cá nhân chạy hoàn chỉnh trên máy tính và điện thoại, có kế hoạch học theo ngày, thư viện luyện bốn kỹ năng, hai chế độ thi có giờ, từ vựng, ôn lỗi sai, lịch sử tiến bộ, ghi âm, sao lưu và đồng bộ Supabase thủ công. Giao diện đã được chuyển sang tone hồng pastel, tối ưu cho tiếng Việt và cá nhân hóa cho Gùa. Code trên nhánh </w:t>
-      </w:r>
-      <w:r>
-        <w:rPr>
-          <w:rFonts w:ascii="Consolas" w:hAnsi="Consolas" w:eastAsia="Consolas"/>
-          <w:color w:val="4A3B42"/>
-          <w:sz w:val="19"/>
-        </w:rPr>
-        <w:t>main</w:t>
-      </w:r>
+        <w:t>Mây hiện là một ứng dụng luyện VSTEP cá nhân có kế hoạch học theo ngày, thư viện luyện bốn kỹ năng, hai chế độ thi có giờ, từ vựng, ôn lỗi sai, lịch sử tiến bộ, ghi âm, sao lưu và đồng bộ Supabase thủ công. Giao diện đã được kiểm thử tự động ở viewport máy tính và điện thoại, chuyển sang tone hồng pastel, tối ưu cho tiếng Việt và cá nhân hóa cho Gùa. Bản build production và GitHub Actions đã đạt; chưa có nghiệm thu trên iOS/Android thật.</w:t>
+      </w:r>
+    </w:p>
+    <w:p>
       <w:r>
         <w:rPr>
           <w:rFonts w:ascii="Arial" w:hAnsi="Arial" w:eastAsia="Arial"/>
           <w:color w:val="211D20"/>
           <w:sz w:val="20"/>
         </w:rPr>
-        <w:t xml:space="preserve"> đang sạch, bản build production thành công và GitHub Actions đã đạt.</w:t>
+        <w:t>Sản phẩm đủ để Gùa pilot hằng ngày trên môi trường local nhằm thu thập phản hồi thực tế. Chưa nên mô tả đây là hệ luyện thi VSTEP toàn diện đã được kiểm định hoặc sẵn sàng production. Nội dung đang là nội dung tự biên soạn, mới có một đề đủ cấu trúc, bài Nghe dùng giọng tổng hợp và bài Viết/Nói chưa có chấm điểm từ giáo viên hoặc AI. Website cũng chưa được triển khai lên tên miền HTTPS công khai và chưa được nghiệm thu trên thiết bị thật của người học.</w:t>
       </w:r>
     </w:p>
     <w:p>
@@ -601,17 +595,7 @@
           <w:color w:val="211D20"/>
           <w:sz w:val="20"/>
         </w:rPr>
-        <w:t>Sản phẩm đã đủ để Gùa sử dụng hằng ngày trong phạm vi cá nhân. Tuy nhiên, chưa nên mô tả đây là hệ luyện thi VSTEP toàn diện đã được kiểm định. Nội dung đang là nội dung tự biên soạn, mới có một đề đủ cấu trúc, bài Nghe dùng giọng tổng hợp và bài Viết/Nói chưa có chấm điểm từ giáo viên hoặc AI. Website cũng chưa được triển khai lên tên miền HTTPS công khai và chưa được nghiệm thu trên thiết bị thật của người học.</w:t>
-      </w:r>
-    </w:p>
-    <w:p>
-      <w:r>
-        <w:rPr>
-          <w:rFonts w:ascii="Arial" w:hAnsi="Arial" w:eastAsia="Arial"/>
-          <w:color w:val="211D20"/>
-          <w:sz w:val="20"/>
-        </w:rPr>
-        <w:t>Tại thời điểm bàn giao không có hạng mục code dở dang trên nhánh chính. Những việc tiếp theo là các hạng mục nâng cấp sản phẩm, kiểm định chuyên môn và vận hành production được liệt kê tại Mục 12.</w:t>
+        <w:t>Không có task dở dang trong milestone nền tảng tại mốc bàn giao. Các milestone về học liệu, đánh giá đầu vào, phản hồi Viết/Nói và vận hành production vẫn đang mở và được liệt kê tại Mục 12.</w:t>
       </w:r>
     </w:p>
     <w:p>
@@ -706,7 +690,7 @@
           <w:color w:val="211D20"/>
           <w:sz w:val="20"/>
         </w:rPr>
-        <w:t xml:space="preserve"> Kế hoạch dựa trên mục tiêu, trình độ tự đánh giá, kỹ năng ưu tiên, chủ đề yêu thích, lịch sử học và mức năng lượng trong ngày. Hệ thống không tạo điểm khởi đầu hoặc thành tích giả.</w:t>
+        <w:t xml:space="preserve"> Kế hoạch dựa trên lỗi đến hạn, lỗi sai với mức tự tin cao, độ chính xác gần đây, độ lâu chưa luyện, ngày thi, kỹ năng ưu tiên, chủ đề yêu thích và mức năng lượng. Mỗi bài gợi ý hiển thị lý do được chọn. Hệ thống không tạo điểm khởi đầu hoặc thành tích giả.</w:t>
       </w:r>
     </w:p>
     <w:p>
@@ -920,7 +904,7 @@
                 <w:color w:val="211D20"/>
                 <w:sz w:val="16"/>
               </w:rPr>
-              <w:t>Kế hoạch ngày tự chọn tối đa ba bài theo thời gian, kỹ năng ưu tiên, sở thích và kết quả gần đây</w:t>
+              <w:t>Kế hoạch ngày tự chọn tối đa ba bài theo thời gian, lỗi đến hạn, mức chắc chắn, độ chính xác, độ lâu chưa luyện, ngày thi, kỹ năng ưu tiên và sở thích; từng bài giải thích lý do được chọn</w:t>
             </w:r>
           </w:p>
         </w:tc>
@@ -945,7 +929,7 @@
                 <w:color w:val="211D20"/>
                 <w:sz w:val="16"/>
               </w:rPr>
-              <w:t>Hoàn thành</w:t>
+              <w:t>Hoàn thành bản cá nhân hóa v2 đầu tiên</w:t>
             </w:r>
           </w:p>
         </w:tc>
@@ -1083,7 +1067,7 @@
                 <w:color w:val="211D20"/>
                 <w:sz w:val="16"/>
               </w:rPr>
-              <w:t>Câu sai được gom vào sổ tay, yêu cầu làm lại trước khi xem giải thích và có lịch ôn</w:t>
+              <w:t>Câu sai được gom theo subskill, số lần sai và mức chắc chắn; lỗi “sai nhưng rất chắc” được ưu tiên, yêu cầu làm lại trước khi xem giải thích và có lịch ôn</w:t>
             </w:r>
           </w:p>
         </w:tc>
@@ -1108,7 +1092,7 @@
                 <w:color w:val="211D20"/>
                 <w:sz w:val="16"/>
               </w:rPr>
-              <w:t>Hoàn thành</w:t>
+              <w:t>Hoàn thành bản taxonomy đầu tiên</w:t>
             </w:r>
           </w:p>
         </w:tc>
@@ -3959,7 +3943,7 @@
           <w:color w:val="211D20"/>
           <w:sz w:val="20"/>
         </w:rPr>
-        <w:t>Trạng thái tại commit bàn giao:</w:t>
+        <w:t>Trạng thái kiểm tra local sau vòng cải tiến theo báo cáo:</w:t>
       </w:r>
     </w:p>
     <w:tbl>
@@ -4290,7 +4274,7 @@
                 <w:color w:val="211D20"/>
                 <w:sz w:val="16"/>
               </w:rPr>
-              <w:t>45/45 đạt</w:t>
+              <w:t>46/46 đạt</w:t>
             </w:r>
           </w:p>
         </w:tc>
@@ -4315,7 +4299,7 @@
                 <w:color w:val="211D20"/>
                 <w:sz w:val="16"/>
               </w:rPr>
-              <w:t>Logic học, lịch ôn, chấm điểm, timer, store, speech, cấu trúc đề và migration SQL/RLS</w:t>
+              <w:t>Logic học, confidence, planner, lịch ôn, chấm điểm, timer, store, speech, đề và migration SQL/RLS</w:t>
             </w:r>
           </w:p>
         </w:tc>
@@ -4706,7 +4690,7 @@
                 <w:color w:val="211D20"/>
                 <w:sz w:val="16"/>
               </w:rPr>
-              <w:t>Đạt</w:t>
+              <w:t>Mốc trước đạt</w:t>
             </w:r>
           </w:p>
         </w:tc>
@@ -4732,7 +4716,7 @@
                 <w:color w:val="211D20"/>
                 <w:sz w:val="16"/>
               </w:rPr>
-              <w:t xml:space="preserve">Run 34380020622 cho commit </w:t>
+              <w:t xml:space="preserve">Run 34419561349 cho commit </w:t>
             </w:r>
             <w:r>
               <w:rPr>
@@ -4740,7 +4724,15 @@
                 <w:color w:val="4A3B42"/>
                 <w:sz w:val="15"/>
               </w:rPr>
-              <w:t>ed9007f</w:t>
+              <w:t>9f4d8ea</w:t>
+            </w:r>
+            <w:r>
+              <w:rPr>
+                <w:rFonts w:ascii="Arial" w:hAnsi="Arial" w:eastAsia="Arial"/>
+                <w:color w:val="211D20"/>
+                <w:sz w:val="16"/>
+              </w:rPr>
+              <w:t>; vòng hiện tại được xác nhận lại sau khi push</w:t>
             </w:r>
           </w:p>
         </w:tc>
@@ -7282,7 +7274,7 @@
           <w:color w:val="211D20"/>
           <w:sz w:val="20"/>
         </w:rPr>
-        <w:t>Điều chỉnh kế hoạch theo ngày thi, thời lượng thực tế, lỗi lặp và mức nhớ từ thay vì chỉ dùng ưu tiên tĩnh.</w:t>
+        <w:t>Đã triển khai vòng đầu của kế hoạch theo ngày thi, lỗi đến hạn, lỗi tự tin cao, độ chính xác, recency và diversity guard; cần hiệu chỉnh trọng số sau 5–7 ngày dữ liệu thật.</w:t>
       </w:r>
     </w:p>
     <w:p>
@@ -8877,118 +8869,6 @@
                 <w:color w:val="4A3B42"/>
                 <w:sz w:val="15"/>
               </w:rPr>
-              <w:t>b320a3d</w:t>
-            </w:r>
-          </w:p>
-        </w:tc>
-        <w:tc>
-          <w:tcPr>
-            <w:tcW w:type="dxa" w:w="6707"/>
-            <w:vAlign w:val="center"/>
-            <w:tcMar>
-              <w:top w:w="85" w:type="dxa"/>
-              <w:start w:w="120" w:type="dxa"/>
-              <w:bottom w:w="85" w:type="dxa"/>
-              <w:end w:w="120" w:type="dxa"/>
-            </w:tcMar>
-            <w:shd w:fill="FAF7F8"/>
-          </w:tcPr>
-          <w:p>
-            <w:pPr>
-              <w:spacing w:after="0" w:line="264" w:lineRule="auto"/>
-            </w:pPr>
-            <w:r>
-              <w:rPr>
-                <w:rFonts w:ascii="Arial" w:hAnsi="Arial" w:eastAsia="Arial"/>
-                <w:color w:val="211D20"/>
-                <w:sz w:val="16"/>
-              </w:rPr>
-              <w:t>Sửa quy trình cài dependency có thể tái lập</w:t>
-            </w:r>
-          </w:p>
-        </w:tc>
-      </w:tr>
-      <w:tr>
-        <w:trPr>
-          <w:cantSplit/>
-        </w:trPr>
-        <w:tc>
-          <w:tcPr>
-            <w:tcW w:type="dxa" w:w="3013"/>
-            <w:vAlign w:val="center"/>
-            <w:tcMar>
-              <w:top w:w="85" w:type="dxa"/>
-              <w:start w:w="120" w:type="dxa"/>
-              <w:bottom w:w="85" w:type="dxa"/>
-              <w:end w:w="120" w:type="dxa"/>
-            </w:tcMar>
-          </w:tcPr>
-          <w:p>
-            <w:pPr>
-              <w:spacing w:after="0" w:line="264" w:lineRule="auto"/>
-            </w:pPr>
-            <w:r>
-              <w:rPr>
-                <w:rFonts w:ascii="Consolas" w:hAnsi="Consolas" w:eastAsia="Consolas"/>
-                <w:color w:val="4A3B42"/>
-                <w:sz w:val="15"/>
-              </w:rPr>
-              <w:t>21e1abd</w:t>
-            </w:r>
-          </w:p>
-        </w:tc>
-        <w:tc>
-          <w:tcPr>
-            <w:tcW w:type="dxa" w:w="6707"/>
-            <w:vAlign w:val="center"/>
-            <w:tcMar>
-              <w:top w:w="85" w:type="dxa"/>
-              <w:start w:w="120" w:type="dxa"/>
-              <w:bottom w:w="85" w:type="dxa"/>
-              <w:end w:w="120" w:type="dxa"/>
-            </w:tcMar>
-          </w:tcPr>
-          <w:p>
-            <w:pPr>
-              <w:spacing w:after="0" w:line="264" w:lineRule="auto"/>
-            </w:pPr>
-            <w:r>
-              <w:rPr>
-                <w:rFonts w:ascii="Arial" w:hAnsi="Arial" w:eastAsia="Arial"/>
-                <w:color w:val="211D20"/>
-                <w:sz w:val="16"/>
-              </w:rPr>
-              <w:t>Cập nhật runtime GitHub Actions</w:t>
-            </w:r>
-          </w:p>
-        </w:tc>
-      </w:tr>
-      <w:tr>
-        <w:trPr>
-          <w:cantSplit/>
-        </w:trPr>
-        <w:tc>
-          <w:tcPr>
-            <w:tcW w:type="dxa" w:w="3013"/>
-            <w:vAlign w:val="center"/>
-            <w:tcMar>
-              <w:top w:w="85" w:type="dxa"/>
-              <w:start w:w="120" w:type="dxa"/>
-              <w:bottom w:w="85" w:type="dxa"/>
-              <w:end w:w="120" w:type="dxa"/>
-            </w:tcMar>
-            <w:shd w:fill="FAF7F8"/>
-          </w:tcPr>
-          <w:p>
-            <w:pPr>
-              <w:spacing w:after="0" w:line="264" w:lineRule="auto"/>
-            </w:pPr>
-            <w:r>
-              <w:rPr>
-                <w:rFonts w:ascii="Consolas" w:hAnsi="Consolas" w:eastAsia="Consolas"/>
-                <w:color w:val="4A3B42"/>
-                <w:sz w:val="15"/>
-              </w:rPr>
               <w:t>7e3ab8e</w:t>
             </w:r>
           </w:p>
@@ -9045,7 +8925,7 @@
                 <w:color w:val="4A3B42"/>
                 <w:sz w:val="15"/>
               </w:rPr>
-              <w:t>8b843f4</w:t>
+              <w:t>026a290</w:t>
             </w:r>
           </w:p>
         </w:tc>
@@ -9070,7 +8950,7 @@
                 <w:color w:val="211D20"/>
                 <w:sz w:val="16"/>
               </w:rPr>
-              <w:t>Chuyển giao diện sang pastel rose</w:t>
+              <w:t>Tinh chỉnh bảng màu hồng pastel</w:t>
             </w:r>
           </w:p>
         </w:tc>
@@ -9101,7 +8981,7 @@
                 <w:color w:val="4A3B42"/>
                 <w:sz w:val="15"/>
               </w:rPr>
-              <w:t>026a290</w:t>
+              <w:t>ed9007f</w:t>
             </w:r>
           </w:p>
         </w:tc>
@@ -9127,7 +9007,148 @@
                 <w:color w:val="211D20"/>
                 <w:sz w:val="16"/>
               </w:rPr>
-              <w:t>Tinh chỉnh bảng màu hồng pastel</w:t>
+              <w:t>Cá nhân hóa toàn bộ hành trình cho Gùa và Rùa</w:t>
+            </w:r>
+          </w:p>
+        </w:tc>
+      </w:tr>
+    </w:tbl>
+    <w:p>
+      <w:pPr>
+        <w:spacing w:after="0"/>
+      </w:pPr>
+    </w:p>
+    <w:p>
+      <w:r>
+        <w:br w:type="page"/>
+      </w:r>
+    </w:p>
+    <w:p>
+      <w:pPr>
+        <w:pStyle w:val="Heading1"/>
+      </w:pPr>
+      <w:r>
+        <w:rPr>
+          <w:rFonts w:ascii="Arial" w:hAnsi="Arial" w:eastAsia="Arial"/>
+          <w:color w:val="000000"/>
+          <w:sz w:val="34"/>
+        </w:rPr>
+        <w:t>17. Tiêu chí hoàn tất giai đoạn hiện tại</w:t>
+      </w:r>
+    </w:p>
+    <w:p>
+      <w:r>
+        <w:rPr>
+          <w:rFonts w:ascii="Arial" w:hAnsi="Arial" w:eastAsia="Arial"/>
+          <w:color w:val="211D20"/>
+          <w:sz w:val="20"/>
+        </w:rPr>
+        <w:t>Milestone nền tảng được xem là hoàn tất vì các route chính hoạt động, state được bảo toàn, hai chế độ thi chạy hết luồng, Supabase thật đã xác nhận, test production và CI đều đạt, giao diện đã được kiểm tra ở viewport đại diện và tài liệu vận hành đã có. Giai đoạn production chỉ được xem là hoàn tất sau khi có URL HTTPS, nghiệm thu thiết bị thật, thử đồng bộ hai thiết bị và có người chịu trách nhiệm xác nhận chất lượng học liệu.</w:t>
+      </w:r>
+    </w:p>
+    <w:tbl>
+      <w:tblPr>
+        <w:tblW w:type="auto" w:w="0"/>
+        <w:jc w:val="center"/>
+        <w:tblLayout w:type="fixed"/>
+        <w:tblLook w:firstColumn="1" w:firstRow="1" w:lastColumn="0" w:lastRow="0" w:noHBand="0" w:noVBand="1" w:val="04A0"/>
+        <w:tblBorders>
+          <w:top w:val="single" w:sz="6" w:color="D9D9D9"/>
+          <w:left w:val="single" w:sz="6" w:color="D9D9D9"/>
+          <w:bottom w:val="single" w:sz="6" w:color="D9D9D9"/>
+          <w:right w:val="single" w:sz="6" w:color="D9D9D9"/>
+          <w:insideH w:val="single" w:sz="6" w:color="D9D9D9"/>
+          <w:insideV w:val="single" w:sz="6" w:color="D9D9D9"/>
+        </w:tblBorders>
+      </w:tblPr>
+      <w:tblGrid>
+        <w:gridCol w:w="3289"/>
+        <w:gridCol w:w="3289"/>
+        <w:gridCol w:w="3289"/>
+      </w:tblGrid>
+      <w:tr>
+        <w:trPr>
+          <w:cantSplit/>
+          <w:tblHeader w:val="true"/>
+        </w:trPr>
+        <w:tc>
+          <w:tcPr>
+            <w:tcW w:type="dxa" w:w="2236"/>
+            <w:vAlign w:val="center"/>
+            <w:tcMar>
+              <w:top w:w="85" w:type="dxa"/>
+              <w:start w:w="120" w:type="dxa"/>
+              <w:bottom w:w="85" w:type="dxa"/>
+              <w:end w:w="120" w:type="dxa"/>
+            </w:tcMar>
+            <w:shd w:fill="4A3B42"/>
+          </w:tcPr>
+          <w:p>
+            <w:pPr>
+              <w:spacing w:after="0" w:line="264" w:lineRule="auto"/>
+            </w:pPr>
+            <w:r>
+              <w:rPr>
+                <w:rFonts w:ascii="Arial" w:hAnsi="Arial" w:eastAsia="Arial"/>
+                <w:b/>
+                <w:color w:val="FFFFFF"/>
+                <w:sz w:val="16"/>
+              </w:rPr>
+              <w:t>Nhóm tiêu chí</w:t>
+            </w:r>
+          </w:p>
+        </w:tc>
+        <w:tc>
+          <w:tcPr>
+            <w:tcW w:type="dxa" w:w="5540"/>
+            <w:vAlign w:val="center"/>
+            <w:tcMar>
+              <w:top w:w="85" w:type="dxa"/>
+              <w:start w:w="120" w:type="dxa"/>
+              <w:bottom w:w="85" w:type="dxa"/>
+              <w:end w:w="120" w:type="dxa"/>
+            </w:tcMar>
+            <w:shd w:fill="4A3B42"/>
+          </w:tcPr>
+          <w:p>
+            <w:pPr>
+              <w:spacing w:after="0" w:line="264" w:lineRule="auto"/>
+            </w:pPr>
+            <w:r>
+              <w:rPr>
+                <w:rFonts w:ascii="Arial" w:hAnsi="Arial" w:eastAsia="Arial"/>
+                <w:b/>
+                <w:color w:val="FFFFFF"/>
+                <w:sz w:val="16"/>
+              </w:rPr>
+              <w:t>Kết luận hiện tại</w:t>
+            </w:r>
+          </w:p>
+        </w:tc>
+        <w:tc>
+          <w:tcPr>
+            <w:tcW w:type="dxa" w:w="1944"/>
+            <w:vAlign w:val="center"/>
+            <w:tcMar>
+              <w:top w:w="85" w:type="dxa"/>
+              <w:start w:w="120" w:type="dxa"/>
+              <w:bottom w:w="85" w:type="dxa"/>
+              <w:end w:w="120" w:type="dxa"/>
+            </w:tcMar>
+            <w:shd w:fill="4A3B42"/>
+          </w:tcPr>
+          <w:p>
+            <w:pPr>
+              <w:spacing w:after="0" w:line="264" w:lineRule="auto"/>
+            </w:pPr>
+            <w:r>
+              <w:rPr>
+                <w:rFonts w:ascii="Arial" w:hAnsi="Arial" w:eastAsia="Arial"/>
+                <w:b/>
+                <w:color w:val="FFFFFF"/>
+                <w:sz w:val="16"/>
+              </w:rPr>
+              <w:t>Bằng chứng hoặc bước còn thiếu</w:t>
             </w:r>
           </w:p>
         </w:tc>
@@ -9138,32 +9159,7 @@
         </w:trPr>
         <w:tc>
           <w:tcPr>
-            <w:tcW w:type="dxa" w:w="3013"/>
-            <w:vAlign w:val="center"/>
-            <w:tcMar>
-              <w:top w:w="85" w:type="dxa"/>
-              <w:start w:w="120" w:type="dxa"/>
-              <w:bottom w:w="85" w:type="dxa"/>
-              <w:end w:w="120" w:type="dxa"/>
-            </w:tcMar>
-          </w:tcPr>
-          <w:p>
-            <w:pPr>
-              <w:spacing w:after="0" w:line="264" w:lineRule="auto"/>
-            </w:pPr>
-            <w:r>
-              <w:rPr>
-                <w:rFonts w:ascii="Consolas" w:hAnsi="Consolas" w:eastAsia="Consolas"/>
-                <w:color w:val="4A3B42"/>
-                <w:sz w:val="15"/>
-              </w:rPr>
-              <w:t>ed9007f</w:t>
-            </w:r>
-          </w:p>
-        </w:tc>
-        <w:tc>
-          <w:tcPr>
-            <w:tcW w:type="dxa" w:w="6707"/>
+            <w:tcW w:type="dxa" w:w="2236"/>
             <w:vAlign w:val="center"/>
             <w:tcMar>
               <w:top w:w="85" w:type="dxa"/>
@@ -9182,7 +9178,383 @@
                 <w:color w:val="211D20"/>
                 <w:sz w:val="16"/>
               </w:rPr>
-              <w:t>Cá nhân hóa toàn bộ hành trình cho Gùa và Rùa</w:t>
+              <w:t>Nền tảng kỹ thuật</w:t>
+            </w:r>
+          </w:p>
+        </w:tc>
+        <w:tc>
+          <w:tcPr>
+            <w:tcW w:type="dxa" w:w="5540"/>
+            <w:vAlign w:val="center"/>
+            <w:tcMar>
+              <w:top w:w="85" w:type="dxa"/>
+              <w:start w:w="120" w:type="dxa"/>
+              <w:bottom w:w="85" w:type="dxa"/>
+              <w:end w:w="120" w:type="dxa"/>
+            </w:tcMar>
+          </w:tcPr>
+          <w:p>
+            <w:pPr>
+              <w:spacing w:after="0" w:line="264" w:lineRule="auto"/>
+            </w:pPr>
+            <w:r>
+              <w:rPr>
+                <w:rFonts w:ascii="Arial" w:hAnsi="Arial" w:eastAsia="Arial"/>
+                <w:color w:val="211D20"/>
+                <w:sz w:val="16"/>
+              </w:rPr>
+              <w:t>Đạt milestone</w:t>
+            </w:r>
+          </w:p>
+        </w:tc>
+        <w:tc>
+          <w:tcPr>
+            <w:tcW w:type="dxa" w:w="1944"/>
+            <w:vAlign w:val="center"/>
+            <w:tcMar>
+              <w:top w:w="85" w:type="dxa"/>
+              <w:start w:w="120" w:type="dxa"/>
+              <w:bottom w:w="85" w:type="dxa"/>
+              <w:end w:w="120" w:type="dxa"/>
+            </w:tcMar>
+          </w:tcPr>
+          <w:p>
+            <w:pPr>
+              <w:spacing w:after="0" w:line="264" w:lineRule="auto"/>
+            </w:pPr>
+            <w:r>
+              <w:rPr>
+                <w:rFonts w:ascii="Arial" w:hAnsi="Arial" w:eastAsia="Arial"/>
+                <w:color w:val="211D20"/>
+                <w:sz w:val="16"/>
+              </w:rPr>
+              <w:t>Build, unit, E2E, accessibility, Supabase Auth/RLS và backup đã kiểm tra</w:t>
+            </w:r>
+          </w:p>
+        </w:tc>
+      </w:tr>
+      <w:tr>
+        <w:trPr>
+          <w:cantSplit/>
+        </w:trPr>
+        <w:tc>
+          <w:tcPr>
+            <w:tcW w:type="dxa" w:w="2236"/>
+            <w:vAlign w:val="center"/>
+            <w:tcMar>
+              <w:top w:w="85" w:type="dxa"/>
+              <w:start w:w="120" w:type="dxa"/>
+              <w:bottom w:w="85" w:type="dxa"/>
+              <w:end w:w="120" w:type="dxa"/>
+            </w:tcMar>
+            <w:shd w:fill="FAF7F8"/>
+          </w:tcPr>
+          <w:p>
+            <w:pPr>
+              <w:spacing w:after="0" w:line="264" w:lineRule="auto"/>
+            </w:pPr>
+            <w:r>
+              <w:rPr>
+                <w:rFonts w:ascii="Arial" w:hAnsi="Arial" w:eastAsia="Arial"/>
+                <w:color w:val="211D20"/>
+                <w:sz w:val="16"/>
+              </w:rPr>
+              <w:t>Cá nhân hóa</w:t>
+            </w:r>
+          </w:p>
+        </w:tc>
+        <w:tc>
+          <w:tcPr>
+            <w:tcW w:type="dxa" w:w="5540"/>
+            <w:vAlign w:val="center"/>
+            <w:tcMar>
+              <w:top w:w="85" w:type="dxa"/>
+              <w:start w:w="120" w:type="dxa"/>
+              <w:bottom w:w="85" w:type="dxa"/>
+              <w:end w:w="120" w:type="dxa"/>
+            </w:tcMar>
+            <w:shd w:fill="FAF7F8"/>
+          </w:tcPr>
+          <w:p>
+            <w:pPr>
+              <w:spacing w:after="0" w:line="264" w:lineRule="auto"/>
+            </w:pPr>
+            <w:r>
+              <w:rPr>
+                <w:rFonts w:ascii="Arial" w:hAnsi="Arial" w:eastAsia="Arial"/>
+                <w:color w:val="211D20"/>
+                <w:sz w:val="16"/>
+              </w:rPr>
+              <w:t>Đạt vòng v2 đầu</w:t>
+            </w:r>
+          </w:p>
+        </w:tc>
+        <w:tc>
+          <w:tcPr>
+            <w:tcW w:type="dxa" w:w="1944"/>
+            <w:vAlign w:val="center"/>
+            <w:tcMar>
+              <w:top w:w="85" w:type="dxa"/>
+              <w:start w:w="120" w:type="dxa"/>
+              <w:bottom w:w="85" w:type="dxa"/>
+              <w:end w:w="120" w:type="dxa"/>
+            </w:tcMar>
+            <w:shd w:fill="FAF7F8"/>
+          </w:tcPr>
+          <w:p>
+            <w:pPr>
+              <w:spacing w:after="0" w:line="264" w:lineRule="auto"/>
+            </w:pPr>
+            <w:r>
+              <w:rPr>
+                <w:rFonts w:ascii="Arial" w:hAnsi="Arial" w:eastAsia="Arial"/>
+                <w:color w:val="211D20"/>
+                <w:sz w:val="16"/>
+              </w:rPr>
+              <w:t>Có confidence, due review, weakness, recency, exam urgency và lý do chọn bài</w:t>
+            </w:r>
+          </w:p>
+        </w:tc>
+      </w:tr>
+      <w:tr>
+        <w:trPr>
+          <w:cantSplit/>
+        </w:trPr>
+        <w:tc>
+          <w:tcPr>
+            <w:tcW w:type="dxa" w:w="2236"/>
+            <w:vAlign w:val="center"/>
+            <w:tcMar>
+              <w:top w:w="85" w:type="dxa"/>
+              <w:start w:w="120" w:type="dxa"/>
+              <w:bottom w:w="85" w:type="dxa"/>
+              <w:end w:w="120" w:type="dxa"/>
+            </w:tcMar>
+          </w:tcPr>
+          <w:p>
+            <w:pPr>
+              <w:spacing w:after="0" w:line="264" w:lineRule="auto"/>
+            </w:pPr>
+            <w:r>
+              <w:rPr>
+                <w:rFonts w:ascii="Arial" w:hAnsi="Arial" w:eastAsia="Arial"/>
+                <w:color w:val="211D20"/>
+                <w:sz w:val="16"/>
+              </w:rPr>
+              <w:t>Hiệu quả học tập</w:t>
+            </w:r>
+          </w:p>
+        </w:tc>
+        <w:tc>
+          <w:tcPr>
+            <w:tcW w:type="dxa" w:w="5540"/>
+            <w:vAlign w:val="center"/>
+            <w:tcMar>
+              <w:top w:w="85" w:type="dxa"/>
+              <w:start w:w="120" w:type="dxa"/>
+              <w:bottom w:w="85" w:type="dxa"/>
+              <w:end w:w="120" w:type="dxa"/>
+            </w:tcMar>
+          </w:tcPr>
+          <w:p>
+            <w:pPr>
+              <w:spacing w:after="0" w:line="264" w:lineRule="auto"/>
+            </w:pPr>
+            <w:r>
+              <w:rPr>
+                <w:rFonts w:ascii="Arial" w:hAnsi="Arial" w:eastAsia="Arial"/>
+                <w:color w:val="211D20"/>
+                <w:sz w:val="16"/>
+              </w:rPr>
+              <w:t>Chưa kết luận</w:t>
+            </w:r>
+          </w:p>
+        </w:tc>
+        <w:tc>
+          <w:tcPr>
+            <w:tcW w:type="dxa" w:w="1944"/>
+            <w:vAlign w:val="center"/>
+            <w:tcMar>
+              <w:top w:w="85" w:type="dxa"/>
+              <w:start w:w="120" w:type="dxa"/>
+              <w:bottom w:w="85" w:type="dxa"/>
+              <w:end w:w="120" w:type="dxa"/>
+            </w:tcMar>
+          </w:tcPr>
+          <w:p>
+            <w:pPr>
+              <w:spacing w:after="0" w:line="264" w:lineRule="auto"/>
+            </w:pPr>
+            <w:r>
+              <w:rPr>
+                <w:rFonts w:ascii="Arial" w:hAnsi="Arial" w:eastAsia="Arial"/>
+                <w:color w:val="211D20"/>
+                <w:sz w:val="16"/>
+              </w:rPr>
+              <w:t>Cần 5–7 ngày pilot và checkpoint bằng ngữ liệu chưa từng học</w:t>
+            </w:r>
+          </w:p>
+        </w:tc>
+      </w:tr>
+      <w:tr>
+        <w:trPr>
+          <w:cantSplit/>
+        </w:trPr>
+        <w:tc>
+          <w:tcPr>
+            <w:tcW w:type="dxa" w:w="2236"/>
+            <w:vAlign w:val="center"/>
+            <w:tcMar>
+              <w:top w:w="85" w:type="dxa"/>
+              <w:start w:w="120" w:type="dxa"/>
+              <w:bottom w:w="85" w:type="dxa"/>
+              <w:end w:w="120" w:type="dxa"/>
+            </w:tcMar>
+            <w:shd w:fill="FAF7F8"/>
+          </w:tcPr>
+          <w:p>
+            <w:pPr>
+              <w:spacing w:after="0" w:line="264" w:lineRule="auto"/>
+            </w:pPr>
+            <w:r>
+              <w:rPr>
+                <w:rFonts w:ascii="Arial" w:hAnsi="Arial" w:eastAsia="Arial"/>
+                <w:color w:val="211D20"/>
+                <w:sz w:val="16"/>
+              </w:rPr>
+              <w:t>Chất lượng học liệu</w:t>
+            </w:r>
+          </w:p>
+        </w:tc>
+        <w:tc>
+          <w:tcPr>
+            <w:tcW w:type="dxa" w:w="5540"/>
+            <w:vAlign w:val="center"/>
+            <w:tcMar>
+              <w:top w:w="85" w:type="dxa"/>
+              <w:start w:w="120" w:type="dxa"/>
+              <w:bottom w:w="85" w:type="dxa"/>
+              <w:end w:w="120" w:type="dxa"/>
+            </w:tcMar>
+            <w:shd w:fill="FAF7F8"/>
+          </w:tcPr>
+          <w:p>
+            <w:pPr>
+              <w:spacing w:after="0" w:line="264" w:lineRule="auto"/>
+            </w:pPr>
+            <w:r>
+              <w:rPr>
+                <w:rFonts w:ascii="Arial" w:hAnsi="Arial" w:eastAsia="Arial"/>
+                <w:color w:val="211D20"/>
+                <w:sz w:val="16"/>
+              </w:rPr>
+              <w:t>Chưa kiểm định</w:t>
+            </w:r>
+          </w:p>
+        </w:tc>
+        <w:tc>
+          <w:tcPr>
+            <w:tcW w:type="dxa" w:w="1944"/>
+            <w:vAlign w:val="center"/>
+            <w:tcMar>
+              <w:top w:w="85" w:type="dxa"/>
+              <w:start w:w="120" w:type="dxa"/>
+              <w:bottom w:w="85" w:type="dxa"/>
+              <w:end w:w="120" w:type="dxa"/>
+            </w:tcMar>
+            <w:shd w:fill="FAF7F8"/>
+          </w:tcPr>
+          <w:p>
+            <w:pPr>
+              <w:spacing w:after="0" w:line="264" w:lineRule="auto"/>
+            </w:pPr>
+            <w:r>
+              <w:rPr>
+                <w:rFonts w:ascii="Arial" w:hAnsi="Arial" w:eastAsia="Arial"/>
+                <w:color w:val="211D20"/>
+                <w:sz w:val="16"/>
+              </w:rPr>
+              <w:t>Cần giáo viên VSTEP review và version hóa content</w:t>
+            </w:r>
+          </w:p>
+        </w:tc>
+      </w:tr>
+      <w:tr>
+        <w:trPr>
+          <w:cantSplit/>
+        </w:trPr>
+        <w:tc>
+          <w:tcPr>
+            <w:tcW w:type="dxa" w:w="2236"/>
+            <w:vAlign w:val="center"/>
+            <w:tcMar>
+              <w:top w:w="85" w:type="dxa"/>
+              <w:start w:w="120" w:type="dxa"/>
+              <w:bottom w:w="85" w:type="dxa"/>
+              <w:end w:w="120" w:type="dxa"/>
+            </w:tcMar>
+          </w:tcPr>
+          <w:p>
+            <w:pPr>
+              <w:spacing w:after="0" w:line="264" w:lineRule="auto"/>
+            </w:pPr>
+            <w:r>
+              <w:rPr>
+                <w:rFonts w:ascii="Arial" w:hAnsi="Arial" w:eastAsia="Arial"/>
+                <w:color w:val="211D20"/>
+                <w:sz w:val="16"/>
+              </w:rPr>
+              <w:t>Production</w:t>
+            </w:r>
+          </w:p>
+        </w:tc>
+        <w:tc>
+          <w:tcPr>
+            <w:tcW w:type="dxa" w:w="5540"/>
+            <w:vAlign w:val="center"/>
+            <w:tcMar>
+              <w:top w:w="85" w:type="dxa"/>
+              <w:start w:w="120" w:type="dxa"/>
+              <w:bottom w:w="85" w:type="dxa"/>
+              <w:end w:w="120" w:type="dxa"/>
+            </w:tcMar>
+          </w:tcPr>
+          <w:p>
+            <w:pPr>
+              <w:spacing w:after="0" w:line="264" w:lineRule="auto"/>
+            </w:pPr>
+            <w:r>
+              <w:rPr>
+                <w:rFonts w:ascii="Arial" w:hAnsi="Arial" w:eastAsia="Arial"/>
+                <w:color w:val="211D20"/>
+                <w:sz w:val="16"/>
+              </w:rPr>
+              <w:t>Chưa đạt</w:t>
+            </w:r>
+          </w:p>
+        </w:tc>
+        <w:tc>
+          <w:tcPr>
+            <w:tcW w:type="dxa" w:w="1944"/>
+            <w:vAlign w:val="center"/>
+            <w:tcMar>
+              <w:top w:w="85" w:type="dxa"/>
+              <w:start w:w="120" w:type="dxa"/>
+              <w:bottom w:w="85" w:type="dxa"/>
+              <w:end w:w="120" w:type="dxa"/>
+            </w:tcMar>
+          </w:tcPr>
+          <w:p>
+            <w:pPr>
+              <w:spacing w:after="0" w:line="264" w:lineRule="auto"/>
+            </w:pPr>
+            <w:r>
+              <w:rPr>
+                <w:rFonts w:ascii="Arial" w:hAnsi="Arial" w:eastAsia="Arial"/>
+                <w:color w:val="211D20"/>
+                <w:sz w:val="16"/>
+              </w:rPr>
+              <w:t>Cần URL HTTPS, biến môi trường host, kiểm tra hai thiết bị và quy trình vận hành</w:t>
             </w:r>
           </w:p>
         </w:tc>
@@ -9194,26 +9566,45 @@
       </w:pPr>
     </w:p>
     <w:p>
-      <w:pPr>
-        <w:pStyle w:val="Heading1"/>
-      </w:pPr>
-      <w:r>
-        <w:rPr>
-          <w:rFonts w:ascii="Arial" w:hAnsi="Arial" w:eastAsia="Arial"/>
-          <w:color w:val="000000"/>
-          <w:sz w:val="34"/>
-        </w:rPr>
-        <w:t>17. Tiêu chí hoàn tất giai đoạn hiện tại</w:t>
-      </w:r>
-    </w:p>
-    <w:p>
       <w:r>
         <w:rPr>
           <w:rFonts w:ascii="Arial" w:hAnsi="Arial" w:eastAsia="Arial"/>
           <w:color w:val="211D20"/>
           <w:sz w:val="20"/>
         </w:rPr>
-        <w:t>Giai đoạn code nền tảng được xem là hoàn tất vì các route chính hoạt động, state được bảo toàn, hai chế độ thi chạy hết luồng, Supabase thật đã xác nhận, test production và CI đều đạt, giao diện đã được nghiệm thu trực quan và tài liệu vận hành đã có. Giai đoạn production chỉ được xem là hoàn tất sau khi có URL HTTPS, nghiệm thu thiết bị thật, thử đồng bộ hai thiết bị và có người chịu trách nhiệm xác nhận chất lượng học liệu.</w:t>
+        <w:t xml:space="preserve">Người tiếp tục dự án nên dùng </w:t>
+      </w:r>
+      <w:r>
+        <w:rPr>
+          <w:rFonts w:ascii="Consolas" w:hAnsi="Consolas" w:eastAsia="Consolas"/>
+          <w:color w:val="4A3B42"/>
+          <w:sz w:val="19"/>
+        </w:rPr>
+        <w:t>docs/REVIEW-RESPONSE.md</w:t>
+      </w:r>
+      <w:r>
+        <w:rPr>
+          <w:rFonts w:ascii="Arial" w:hAnsi="Arial" w:eastAsia="Arial"/>
+          <w:color w:val="211D20"/>
+          <w:sz w:val="20"/>
+        </w:rPr>
+        <w:t xml:space="preserve"> làm quyết định ưu tiên, </w:t>
+      </w:r>
+      <w:r>
+        <w:rPr>
+          <w:rFonts w:ascii="Consolas" w:hAnsi="Consolas" w:eastAsia="Consolas"/>
+          <w:color w:val="4A3B42"/>
+          <w:sz w:val="19"/>
+        </w:rPr>
+        <w:t>docs/QUALITY.md</w:t>
+      </w:r>
+      <w:r>
+        <w:rPr>
+          <w:rFonts w:ascii="Arial" w:hAnsi="Arial" w:eastAsia="Arial"/>
+          <w:color w:val="211D20"/>
+          <w:sz w:val="20"/>
+        </w:rPr>
+        <w:t xml:space="preserve"> làm bằng chứng kỹ thuật và báo cáo này làm tài liệu bàn giao phạm vi. Không dùng số câu đã học hoặc chuỗi ngày như bằng chứng người học đã đạt bậc VSTEP.</w:t>
       </w:r>
     </w:p>
     <w:p>
@@ -9280,6 +9671,22 @@
           <w:sz w:val="19"/>
         </w:rPr>
         <w:t>docs/STATUS.md</w:t>
+      </w:r>
+      <w:r>
+        <w:rPr>
+          <w:rFonts w:ascii="Arial" w:hAnsi="Arial" w:eastAsia="Arial"/>
+          <w:color w:val="211D20"/>
+          <w:sz w:val="20"/>
+        </w:rPr>
+        <w:t xml:space="preserve">, </w:t>
+      </w:r>
+      <w:r>
+        <w:rPr>
+          <w:rFonts w:ascii="Consolas" w:hAnsi="Consolas" w:eastAsia="Consolas"/>
+          <w:color w:val="4A3B42"/>
+          <w:sz w:val="19"/>
+        </w:rPr>
+        <w:t>docs/REVIEW-RESPONSE.md</w:t>
       </w:r>
       <w:r>
         <w:rPr>

</xml_diff>

<commit_message>
Record verified learning-loop handover status
</commit_message>
<xml_diff>
--- a/docs/Bao-cao-ban-giao-May-VSTEP.docx
+++ b/docs/Bao-cao-ban-giao-May-VSTEP.docx
@@ -4690,7 +4690,7 @@
                 <w:color w:val="211D20"/>
                 <w:sz w:val="16"/>
               </w:rPr>
-              <w:t>Mốc trước đạt</w:t>
+              <w:t>Đạt</w:t>
             </w:r>
           </w:p>
         </w:tc>
@@ -4716,7 +4716,7 @@
                 <w:color w:val="211D20"/>
                 <w:sz w:val="16"/>
               </w:rPr>
-              <w:t xml:space="preserve">Run 34419561349 cho commit </w:t>
+              <w:t xml:space="preserve">Run 34435381574 cho commit triển khai </w:t>
             </w:r>
             <w:r>
               <w:rPr>
@@ -4724,15 +4724,7 @@
                 <w:color w:val="4A3B42"/>
                 <w:sz w:val="15"/>
               </w:rPr>
-              <w:t>9f4d8ea</w:t>
-            </w:r>
-            <w:r>
-              <w:rPr>
-                <w:rFonts w:ascii="Arial" w:hAnsi="Arial" w:eastAsia="Arial"/>
-                <w:color w:val="211D20"/>
-                <w:sz w:val="16"/>
-              </w:rPr>
-              <w:t>; vòng hiện tại được xác nhận lại sau khi push</w:t>
+              <w:t>13e6683</w:t>
             </w:r>
           </w:p>
         </w:tc>

</xml_diff>

<commit_message>
Document verified HTTPS pilot deployment
</commit_message>
<xml_diff>
--- a/docs/Bao-cao-ban-giao-May-VSTEP.docx
+++ b/docs/Bao-cao-ban-giao-May-VSTEP.docx
@@ -332,6 +332,62 @@
                 <w:color w:val="C93B72"/>
                 <w:sz w:val="18"/>
               </w:rPr>
+              <w:t>HTTPS pilot</w:t>
+            </w:r>
+          </w:p>
+        </w:tc>
+        <w:tc>
+          <w:tcPr>
+            <w:tcW w:type="dxa" w:w="7344"/>
+            <w:shd w:fill="FAF7F8"/>
+            <w:tcMar>
+              <w:top w:w="130" w:type="dxa"/>
+              <w:start w:w="150" w:type="dxa"/>
+              <w:bottom w:w="130" w:type="dxa"/>
+              <w:end w:w="150" w:type="dxa"/>
+            </w:tcMar>
+            <w:vAlign w:val="center"/>
+          </w:tcPr>
+          <w:p>
+            <w:pPr>
+              <w:spacing w:after="0"/>
+            </w:pPr>
+            <w:hyperlink r:id="rId12">
+              <w:r>
+                <w:rPr>
+                  <w:color w:val="C93B72"/>
+                  <w:u w:val="single"/>
+                </w:rPr>
+                <w:t>vstep-turtle.vercel.app</w:t>
+              </w:r>
+            </w:hyperlink>
+          </w:p>
+        </w:tc>
+      </w:tr>
+      <w:tr>
+        <w:tc>
+          <w:tcPr>
+            <w:tcW w:type="dxa" w:w="1944"/>
+            <w:shd w:fill="FCEEF4"/>
+            <w:tcMar>
+              <w:top w:w="130" w:type="dxa"/>
+              <w:start w:w="150" w:type="dxa"/>
+              <w:bottom w:w="130" w:type="dxa"/>
+              <w:end w:w="150" w:type="dxa"/>
+            </w:tcMar>
+            <w:vAlign w:val="center"/>
+          </w:tcPr>
+          <w:p>
+            <w:pPr>
+              <w:spacing w:after="0"/>
+            </w:pPr>
+            <w:r>
+              <w:rPr>
+                <w:rFonts w:ascii="Arial" w:hAnsi="Arial" w:eastAsia="Arial"/>
+                <w:b/>
+                <w:color w:val="C93B72"/>
+                <w:sz w:val="18"/>
+              </w:rPr>
               <w:t>Người học</w:t>
             </w:r>
           </w:p>
@@ -339,7 +395,6 @@
         <w:tc>
           <w:tcPr>
             <w:tcW w:type="dxa" w:w="7344"/>
-            <w:shd w:fill="FAF7F8"/>
             <w:tcMar>
               <w:top w:w="130" w:type="dxa"/>
               <w:start w:w="150" w:type="dxa"/>
@@ -388,7 +443,7 @@
           <w:color w:val="211D20"/>
           <w:sz w:val="22"/>
         </w:rPr>
-        <w:t>Bản code hiện đủ để Gùa pilot hằng ngày trên local, Supabase thật đã kết nối và kiểm thử, toàn bộ pipeline kiểm tra đang đạt. Daily Mission đã giải thích lý do chọn bài và ưu tiên lỗi đến hạn hoặc sai với mức tự tin cao. Các điều kiện còn thiếu để gọi là production hoàn chỉnh là URL HTTPS, nghiệm thu thiết bị thật, thử đồng bộ hai thiết bị và thẩm định học liệu bởi giáo viên VSTEP.</w:t>
+        <w:t>Bản code hiện đủ để Gùa pilot hằng ngày trên URL HTTPS hoặc local, Supabase thật đã kết nối và toàn bộ pipeline kiểm tra đang đạt. Daily Mission đã giải thích lý do chọn bài và ưu tiên lỗi đến hạn hoặc sai với mức tự tin cao. Các điều kiện còn thiếu để nghiệm thu production là login/sync trên bản host, micro và thiết bị thật, thử đồng bộ hai thiết bị cùng thẩm định học liệu bởi giáo viên VSTEP.</w:t>
       </w:r>
     </w:p>
     <w:p>
@@ -575,7 +630,7 @@
           <w:color w:val="211D20"/>
           <w:sz w:val="20"/>
         </w:rPr>
-        <w:t>Mây hiện là một ứng dụng luyện VSTEP cá nhân có kế hoạch học theo ngày, thư viện luyện bốn kỹ năng, hai chế độ thi có giờ, từ vựng, ôn lỗi sai, lịch sử tiến bộ, ghi âm, sao lưu và đồng bộ Supabase thủ công. Giao diện đã được kiểm thử tự động ở viewport máy tính và điện thoại, chuyển sang tone hồng pastel, tối ưu cho tiếng Việt và cá nhân hóa cho Gùa. Bản build production và GitHub Actions đã đạt; chưa có nghiệm thu trên iOS/Android thật.</w:t>
+        <w:t>Mây hiện là một ứng dụng luyện VSTEP cá nhân có kế hoạch học theo ngày, thư viện luyện bốn kỹ năng, hai chế độ thi có giờ, từ vựng, ôn lỗi sai, lịch sử tiến bộ, ghi âm, sao lưu và đồng bộ Supabase thủ công. Giao diện đã được kiểm thử tự động ở viewport máy tính và điện thoại, chuyển sang tone hồng pastel, tối ưu cho tiếng Việt và cá nhân hóa cho Gùa. Bản build, GitHub Actions và smoke test trên URL HTTPS pilot đã đạt; chưa có nghiệm thu trên iOS/Android thật.</w:t>
       </w:r>
     </w:p>
     <w:p>
@@ -585,7 +640,7 @@
           <w:color w:val="211D20"/>
           <w:sz w:val="20"/>
         </w:rPr>
-        <w:t>Sản phẩm đủ để Gùa pilot hằng ngày trên môi trường local nhằm thu thập phản hồi thực tế. Chưa nên mô tả đây là hệ luyện thi VSTEP toàn diện đã được kiểm định hoặc sẵn sàng production. Nội dung đang là nội dung tự biên soạn, mới có một đề đủ cấu trúc, bài Nghe dùng giọng tổng hợp và bài Viết/Nói chưa có chấm điểm từ giáo viên hoặc AI. Website cũng chưa được triển khai lên tên miền HTTPS công khai và chưa được nghiệm thu trên thiết bị thật của người học.</w:t>
+        <w:t>Sản phẩm đủ để Gùa pilot hằng ngày trên bản HTTPS hoặc local nhằm thu thập phản hồi thực tế. Chưa nên mô tả đây là hệ luyện thi VSTEP toàn diện đã được kiểm định hoặc đã nghiệm thu production. Nội dung đang là nội dung tự biên soạn, mới có một đề đủ cấu trúc, bài Nghe dùng giọng tổng hợp và bài Viết/Nói chưa có chấm điểm từ giáo viên hoặc AI. Bản host chưa được kiểm thử đăng nhập/sync bằng tài khoản thật, micro hoặc thiết bị thật của người học.</w:t>
       </w:r>
     </w:p>
     <w:p>
@@ -4716,7 +4771,7 @@
                 <w:color w:val="211D20"/>
                 <w:sz w:val="16"/>
               </w:rPr>
-              <w:t xml:space="preserve">Run 34435381574 cho commit triển khai </w:t>
+              <w:t xml:space="preserve">Run 34435602731 cho commit </w:t>
             </w:r>
             <w:r>
               <w:rPr>
@@ -4724,7 +4779,31 @@
                 <w:color w:val="4A3B42"/>
                 <w:sz w:val="15"/>
               </w:rPr>
-              <w:t>13e6683</w:t>
+              <w:t>32697bf</w:t>
+            </w:r>
+            <w:r>
+              <w:rPr>
+                <w:rFonts w:ascii="Arial" w:hAnsi="Arial" w:eastAsia="Arial"/>
+                <w:color w:val="211D20"/>
+                <w:sz w:val="16"/>
+              </w:rPr>
+              <w:t xml:space="preserve">; run triển khai </w:t>
+            </w:r>
+            <w:r>
+              <w:rPr>
+                <w:rFonts w:ascii="Consolas" w:hAnsi="Consolas" w:eastAsia="Consolas"/>
+                <w:color w:val="4A3B42"/>
+                <w:sz w:val="15"/>
+              </w:rPr>
+              <w:t>34435381574</w:t>
+            </w:r>
+            <w:r>
+              <w:rPr>
+                <w:rFonts w:ascii="Arial" w:hAnsi="Arial" w:eastAsia="Arial"/>
+                <w:color w:val="211D20"/>
+                <w:sz w:val="16"/>
+              </w:rPr>
+              <w:t xml:space="preserve"> cũng đạt</w:t>
             </w:r>
           </w:p>
         </w:tc>
@@ -4958,7 +5037,178 @@
                 <w:color w:val="211D20"/>
                 <w:sz w:val="16"/>
               </w:rPr>
-              <w:t>Deploy production HTTPS và tên miền</w:t>
+              <w:t>Hosting HTTPS pilot</w:t>
+            </w:r>
+          </w:p>
+        </w:tc>
+        <w:tc>
+          <w:tcPr>
+            <w:tcW w:type="dxa" w:w="5540"/>
+            <w:vAlign w:val="center"/>
+            <w:tcMar>
+              <w:top w:w="85" w:type="dxa"/>
+              <w:start w:w="120" w:type="dxa"/>
+              <w:bottom w:w="85" w:type="dxa"/>
+              <w:end w:w="120" w:type="dxa"/>
+            </w:tcMar>
+          </w:tcPr>
+          <w:p>
+            <w:pPr>
+              <w:spacing w:after="0" w:line="264" w:lineRule="auto"/>
+            </w:pPr>
+            <w:r>
+              <w:rPr>
+                <w:rFonts w:ascii="Arial" w:hAnsi="Arial" w:eastAsia="Arial"/>
+                <w:color w:val="211D20"/>
+                <w:sz w:val="16"/>
+              </w:rPr>
+              <w:t>Đã có</w:t>
+            </w:r>
+          </w:p>
+        </w:tc>
+        <w:tc>
+          <w:tcPr>
+            <w:tcW w:type="dxa" w:w="1944"/>
+            <w:vAlign w:val="center"/>
+            <w:tcMar>
+              <w:top w:w="85" w:type="dxa"/>
+              <w:start w:w="120" w:type="dxa"/>
+              <w:bottom w:w="85" w:type="dxa"/>
+              <w:end w:w="120" w:type="dxa"/>
+            </w:tcMar>
+          </w:tcPr>
+          <w:p>
+            <w:pPr>
+              <w:spacing w:after="0" w:line="264" w:lineRule="auto"/>
+            </w:pPr>
+            <w:r>
+              <w:rPr>
+                <w:rFonts w:ascii="Consolas" w:hAnsi="Consolas" w:eastAsia="Consolas"/>
+                <w:color w:val="4A3B42"/>
+                <w:sz w:val="15"/>
+              </w:rPr>
+              <w:t>vstep-turtle.vercel.app</w:t>
+            </w:r>
+            <w:r>
+              <w:rPr>
+                <w:rFonts w:ascii="Arial" w:hAnsi="Arial" w:eastAsia="Arial"/>
+                <w:color w:val="211D20"/>
+                <w:sz w:val="16"/>
+              </w:rPr>
+              <w:t>; 10 route 200, 404 và headers đã smoke test</w:t>
+            </w:r>
+          </w:p>
+        </w:tc>
+      </w:tr>
+      <w:tr>
+        <w:trPr>
+          <w:cantSplit/>
+        </w:trPr>
+        <w:tc>
+          <w:tcPr>
+            <w:tcW w:type="dxa" w:w="2236"/>
+            <w:vAlign w:val="center"/>
+            <w:tcMar>
+              <w:top w:w="85" w:type="dxa"/>
+              <w:start w:w="120" w:type="dxa"/>
+              <w:bottom w:w="85" w:type="dxa"/>
+              <w:end w:w="120" w:type="dxa"/>
+            </w:tcMar>
+            <w:shd w:fill="FAF7F8"/>
+          </w:tcPr>
+          <w:p>
+            <w:pPr>
+              <w:spacing w:after="0" w:line="264" w:lineRule="auto"/>
+            </w:pPr>
+            <w:r>
+              <w:rPr>
+                <w:rFonts w:ascii="Arial" w:hAnsi="Arial" w:eastAsia="Arial"/>
+                <w:color w:val="211D20"/>
+                <w:sz w:val="16"/>
+              </w:rPr>
+              <w:t>Đăng nhập/sync trên bản host</w:t>
+            </w:r>
+          </w:p>
+        </w:tc>
+        <w:tc>
+          <w:tcPr>
+            <w:tcW w:type="dxa" w:w="5540"/>
+            <w:vAlign w:val="center"/>
+            <w:tcMar>
+              <w:top w:w="85" w:type="dxa"/>
+              <w:start w:w="120" w:type="dxa"/>
+              <w:bottom w:w="85" w:type="dxa"/>
+              <w:end w:w="120" w:type="dxa"/>
+            </w:tcMar>
+            <w:shd w:fill="FAF7F8"/>
+          </w:tcPr>
+          <w:p>
+            <w:pPr>
+              <w:spacing w:after="0" w:line="264" w:lineRule="auto"/>
+            </w:pPr>
+            <w:r>
+              <w:rPr>
+                <w:rFonts w:ascii="Arial" w:hAnsi="Arial" w:eastAsia="Arial"/>
+                <w:color w:val="211D20"/>
+                <w:sz w:val="16"/>
+              </w:rPr>
+              <w:t>Chưa nghiệm thu</w:t>
+            </w:r>
+          </w:p>
+        </w:tc>
+        <w:tc>
+          <w:tcPr>
+            <w:tcW w:type="dxa" w:w="1944"/>
+            <w:vAlign w:val="center"/>
+            <w:tcMar>
+              <w:top w:w="85" w:type="dxa"/>
+              <w:start w:w="120" w:type="dxa"/>
+              <w:bottom w:w="85" w:type="dxa"/>
+              <w:end w:w="120" w:type="dxa"/>
+            </w:tcMar>
+            <w:shd w:fill="FAF7F8"/>
+          </w:tcPr>
+          <w:p>
+            <w:pPr>
+              <w:spacing w:after="0" w:line="264" w:lineRule="auto"/>
+            </w:pPr>
+            <w:r>
+              <w:rPr>
+                <w:rFonts w:ascii="Arial" w:hAnsi="Arial" w:eastAsia="Arial"/>
+                <w:color w:val="211D20"/>
+                <w:sz w:val="16"/>
+              </w:rPr>
+              <w:t>Form cloud đã bật nhưng chưa dùng tài khoản thật trên URL production</w:t>
+            </w:r>
+          </w:p>
+        </w:tc>
+      </w:tr>
+      <w:tr>
+        <w:trPr>
+          <w:cantSplit/>
+        </w:trPr>
+        <w:tc>
+          <w:tcPr>
+            <w:tcW w:type="dxa" w:w="2236"/>
+            <w:vAlign w:val="center"/>
+            <w:tcMar>
+              <w:top w:w="85" w:type="dxa"/>
+              <w:start w:w="120" w:type="dxa"/>
+              <w:bottom w:w="85" w:type="dxa"/>
+              <w:end w:w="120" w:type="dxa"/>
+            </w:tcMar>
+          </w:tcPr>
+          <w:p>
+            <w:pPr>
+              <w:spacing w:after="0" w:line="264" w:lineRule="auto"/>
+            </w:pPr>
+            <w:r>
+              <w:rPr>
+                <w:rFonts w:ascii="Arial" w:hAnsi="Arial" w:eastAsia="Arial"/>
+                <w:color w:val="211D20"/>
+                <w:sz w:val="16"/>
+              </w:rPr>
+              <w:t>Nghiệm thu thiết bị thật</w:t>
             </w:r>
           </w:p>
         </w:tc>
@@ -5008,7 +5258,7 @@
                 <w:color w:val="211D20"/>
                 <w:sz w:val="16"/>
               </w:rPr>
-              <w:t>Chưa có URL cho người học dùng bên ngoài máy local</w:t>
+              <w:t>Chưa xác nhận micro, giọng đọc, Safari/iOS và hành vi khi màn hình tắt</w:t>
             </w:r>
           </w:p>
         </w:tc>
@@ -5039,7 +5289,7 @@
                 <w:color w:val="211D20"/>
                 <w:sz w:val="16"/>
               </w:rPr>
-              <w:t>Nghiệm thu thiết bị thật</w:t>
+              <w:t>Thẩm định học liệu bởi giáo viên VSTEP</w:t>
             </w:r>
           </w:p>
         </w:tc>
@@ -5091,7 +5341,7 @@
                 <w:color w:val="211D20"/>
                 <w:sz w:val="16"/>
               </w:rPr>
-              <w:t>Chưa xác nhận micro, giọng đọc, Safari/iOS và hành vi khi màn hình tắt</w:t>
+              <w:t>Không thể khẳng định độ khó hoặc khả năng dự báo bậc</w:t>
             </w:r>
           </w:p>
         </w:tc>
@@ -5121,7 +5371,7 @@
                 <w:color w:val="211D20"/>
                 <w:sz w:val="16"/>
               </w:rPr>
-              <w:t>Thẩm định học liệu bởi giáo viên VSTEP</w:t>
+              <w:t>Ngân hàng đề độc lập</w:t>
             </w:r>
           </w:p>
         </w:tc>
@@ -5146,7 +5396,7 @@
                 <w:color w:val="211D20"/>
                 <w:sz w:val="16"/>
               </w:rPr>
-              <w:t>Chưa làm</w:t>
+              <w:t>Mới có một đề đủ cấu trúc</w:t>
             </w:r>
           </w:p>
         </w:tc>
@@ -5171,7 +5421,7 @@
                 <w:color w:val="211D20"/>
                 <w:sz w:val="16"/>
               </w:rPr>
-              <w:t>Không thể khẳng định độ khó hoặc khả năng dự báo bậc</w:t>
+              <w:t>Dùng lâu dài sẽ gặp lại ngữ liệu và đề Viết/Nói</w:t>
             </w:r>
           </w:p>
         </w:tc>
@@ -5202,170 +5452,7 @@
                 <w:color w:val="211D20"/>
                 <w:sz w:val="16"/>
               </w:rPr>
-              <w:t>Ngân hàng đề độc lập</w:t>
-            </w:r>
-          </w:p>
-        </w:tc>
-        <w:tc>
-          <w:tcPr>
-            <w:tcW w:type="dxa" w:w="5540"/>
-            <w:vAlign w:val="center"/>
-            <w:tcMar>
-              <w:top w:w="85" w:type="dxa"/>
-              <w:start w:w="120" w:type="dxa"/>
-              <w:bottom w:w="85" w:type="dxa"/>
-              <w:end w:w="120" w:type="dxa"/>
-            </w:tcMar>
-            <w:shd w:fill="FAF7F8"/>
-          </w:tcPr>
-          <w:p>
-            <w:pPr>
-              <w:spacing w:after="0" w:line="264" w:lineRule="auto"/>
-            </w:pPr>
-            <w:r>
-              <w:rPr>
-                <w:rFonts w:ascii="Arial" w:hAnsi="Arial" w:eastAsia="Arial"/>
-                <w:color w:val="211D20"/>
-                <w:sz w:val="16"/>
-              </w:rPr>
-              <w:t>Mới có một đề đủ cấu trúc</w:t>
-            </w:r>
-          </w:p>
-        </w:tc>
-        <w:tc>
-          <w:tcPr>
-            <w:tcW w:type="dxa" w:w="1944"/>
-            <w:vAlign w:val="center"/>
-            <w:tcMar>
-              <w:top w:w="85" w:type="dxa"/>
-              <w:start w:w="120" w:type="dxa"/>
-              <w:bottom w:w="85" w:type="dxa"/>
-              <w:end w:w="120" w:type="dxa"/>
-            </w:tcMar>
-            <w:shd w:fill="FAF7F8"/>
-          </w:tcPr>
-          <w:p>
-            <w:pPr>
-              <w:spacing w:after="0" w:line="264" w:lineRule="auto"/>
-            </w:pPr>
-            <w:r>
-              <w:rPr>
-                <w:rFonts w:ascii="Arial" w:hAnsi="Arial" w:eastAsia="Arial"/>
-                <w:color w:val="211D20"/>
-                <w:sz w:val="16"/>
-              </w:rPr>
-              <w:t>Dùng lâu dài sẽ gặp lại ngữ liệu và đề Viết/Nói</w:t>
-            </w:r>
-          </w:p>
-        </w:tc>
-      </w:tr>
-      <w:tr>
-        <w:trPr>
-          <w:cantSplit/>
-        </w:trPr>
-        <w:tc>
-          <w:tcPr>
-            <w:tcW w:type="dxa" w:w="2236"/>
-            <w:vAlign w:val="center"/>
-            <w:tcMar>
-              <w:top w:w="85" w:type="dxa"/>
-              <w:start w:w="120" w:type="dxa"/>
-              <w:bottom w:w="85" w:type="dxa"/>
-              <w:end w:w="120" w:type="dxa"/>
-            </w:tcMar>
-          </w:tcPr>
-          <w:p>
-            <w:pPr>
-              <w:spacing w:after="0" w:line="264" w:lineRule="auto"/>
-            </w:pPr>
-            <w:r>
-              <w:rPr>
-                <w:rFonts w:ascii="Arial" w:hAnsi="Arial" w:eastAsia="Arial"/>
-                <w:color w:val="211D20"/>
-                <w:sz w:val="16"/>
-              </w:rPr>
               <w:t>Bản thu người nói cho Nghe</w:t>
-            </w:r>
-          </w:p>
-        </w:tc>
-        <w:tc>
-          <w:tcPr>
-            <w:tcW w:type="dxa" w:w="5540"/>
-            <w:vAlign w:val="center"/>
-            <w:tcMar>
-              <w:top w:w="85" w:type="dxa"/>
-              <w:start w:w="120" w:type="dxa"/>
-              <w:bottom w:w="85" w:type="dxa"/>
-              <w:end w:w="120" w:type="dxa"/>
-            </w:tcMar>
-          </w:tcPr>
-          <w:p>
-            <w:pPr>
-              <w:spacing w:after="0" w:line="264" w:lineRule="auto"/>
-            </w:pPr>
-            <w:r>
-              <w:rPr>
-                <w:rFonts w:ascii="Arial" w:hAnsi="Arial" w:eastAsia="Arial"/>
-                <w:color w:val="211D20"/>
-                <w:sz w:val="16"/>
-              </w:rPr>
-              <w:t>Chưa làm</w:t>
-            </w:r>
-          </w:p>
-        </w:tc>
-        <w:tc>
-          <w:tcPr>
-            <w:tcW w:type="dxa" w:w="1944"/>
-            <w:vAlign w:val="center"/>
-            <w:tcMar>
-              <w:top w:w="85" w:type="dxa"/>
-              <w:start w:w="120" w:type="dxa"/>
-              <w:bottom w:w="85" w:type="dxa"/>
-              <w:end w:w="120" w:type="dxa"/>
-            </w:tcMar>
-          </w:tcPr>
-          <w:p>
-            <w:pPr>
-              <w:spacing w:after="0" w:line="264" w:lineRule="auto"/>
-            </w:pPr>
-            <w:r>
-              <w:rPr>
-                <w:rFonts w:ascii="Arial" w:hAnsi="Arial" w:eastAsia="Arial"/>
-                <w:color w:val="211D20"/>
-                <w:sz w:val="16"/>
-              </w:rPr>
-              <w:t>Speech synthesis khác điều kiện thi và chất lượng phụ thuộc thiết bị</w:t>
-            </w:r>
-          </w:p>
-        </w:tc>
-      </w:tr>
-      <w:tr>
-        <w:trPr>
-          <w:cantSplit/>
-        </w:trPr>
-        <w:tc>
-          <w:tcPr>
-            <w:tcW w:type="dxa" w:w="2236"/>
-            <w:vAlign w:val="center"/>
-            <w:tcMar>
-              <w:top w:w="85" w:type="dxa"/>
-              <w:start w:w="120" w:type="dxa"/>
-              <w:bottom w:w="85" w:type="dxa"/>
-              <w:end w:w="120" w:type="dxa"/>
-            </w:tcMar>
-            <w:shd w:fill="FAF7F8"/>
-          </w:tcPr>
-          <w:p>
-            <w:pPr>
-              <w:spacing w:after="0" w:line="264" w:lineRule="auto"/>
-            </w:pPr>
-            <w:r>
-              <w:rPr>
-                <w:rFonts w:ascii="Arial" w:hAnsi="Arial" w:eastAsia="Arial"/>
-                <w:color w:val="211D20"/>
-                <w:sz w:val="16"/>
-              </w:rPr>
-              <w:t>Chấm và phản hồi Viết/Nói</w:t>
             </w:r>
           </w:p>
         </w:tc>
@@ -5417,7 +5504,7 @@
                 <w:color w:val="211D20"/>
                 <w:sz w:val="16"/>
               </w:rPr>
-              <w:t>Người học chỉ tự kiểm tra; không có điểm hoặc phản hồi cá nhân sâu</w:t>
+              <w:t>Speech synthesis khác điều kiện thi và chất lượng phụ thuộc thiết bị</w:t>
             </w:r>
           </w:p>
         </w:tc>
@@ -5447,7 +5534,7 @@
                 <w:color w:val="211D20"/>
                 <w:sz w:val="16"/>
               </w:rPr>
-              <w:t>Đồng bộ audio</w:t>
+              <w:t>Chấm và phản hồi Viết/Nói</w:t>
             </w:r>
           </w:p>
         </w:tc>
@@ -5497,7 +5584,7 @@
                 <w:color w:val="211D20"/>
                 <w:sz w:val="16"/>
               </w:rPr>
-              <w:t>Bản ghi chỉ ở thiết bị và phải tải riêng</w:t>
+              <w:t>Người học chỉ tự kiểm tra; không có điểm hoặc phản hồi cá nhân sâu</w:t>
             </w:r>
           </w:p>
         </w:tc>
@@ -5528,7 +5615,7 @@
                 <w:color w:val="211D20"/>
                 <w:sz w:val="16"/>
               </w:rPr>
-              <w:t>Tự động đồng bộ nhiều thiết bị</w:t>
+              <w:t>Đồng bộ audio</w:t>
             </w:r>
           </w:p>
         </w:tc>
@@ -5580,7 +5667,7 @@
                 <w:color w:val="211D20"/>
                 <w:sz w:val="16"/>
               </w:rPr>
-              <w:t>Người dùng phải chủ động Lưu/Tải và xử lý revision conflict</w:t>
+              <w:t>Bản ghi chỉ ở thiết bị và phải tải riêng</w:t>
             </w:r>
           </w:p>
         </w:tc>
@@ -5610,7 +5697,7 @@
                 <w:color w:val="211D20"/>
                 <w:sz w:val="16"/>
               </w:rPr>
-              <w:t>Hợp nhất chỉnh sửa đồng thời</w:t>
+              <w:t>Tự động đồng bộ nhiều thiết bị</w:t>
             </w:r>
           </w:p>
         </w:tc>
@@ -5660,7 +5747,7 @@
                 <w:color w:val="211D20"/>
                 <w:sz w:val="16"/>
               </w:rPr>
-              <w:t>Hai nhánh lịch sử không tự merge</w:t>
+              <w:t>Người dùng phải chủ động Lưu/Tải và xử lý revision conflict</w:t>
             </w:r>
           </w:p>
         </w:tc>
@@ -5691,7 +5778,7 @@
                 <w:color w:val="211D20"/>
                 <w:sz w:val="16"/>
               </w:rPr>
-              <w:t>PWA/offline đầy đủ</w:t>
+              <w:t>Hợp nhất chỉnh sửa đồng thời</w:t>
             </w:r>
           </w:p>
         </w:tc>
@@ -5743,7 +5830,7 @@
                 <w:color w:val="211D20"/>
                 <w:sz w:val="16"/>
               </w:rPr>
-              <w:t>Không có service worker; chỉ dữ liệu đã tải có thể còn trong cache trình duyệt</w:t>
+              <w:t>Hai nhánh lịch sử không tự merge</w:t>
             </w:r>
           </w:p>
         </w:tc>
@@ -5773,7 +5860,7 @@
                 <w:color w:val="211D20"/>
                 <w:sz w:val="16"/>
               </w:rPr>
-              <w:t>Monitoring và báo lỗi production</w:t>
+              <w:t>PWA/offline đầy đủ</w:t>
             </w:r>
           </w:p>
         </w:tc>
@@ -5823,7 +5910,7 @@
                 <w:color w:val="211D20"/>
                 <w:sz w:val="16"/>
               </w:rPr>
-              <w:t>Chưa có dashboard lỗi hoặc cảnh báo vận hành</w:t>
+              <w:t>Không có service worker; chỉ dữ liệu đã tải có thể còn trong cache trình duyệt</w:t>
             </w:r>
           </w:p>
         </w:tc>
@@ -5854,7 +5941,7 @@
                 <w:color w:val="211D20"/>
                 <w:sz w:val="16"/>
               </w:rPr>
-              <w:t>C1 toàn diện</w:t>
+              <w:t>Monitoring và báo lỗi production</w:t>
             </w:r>
           </w:p>
         </w:tc>
@@ -5906,7 +5993,7 @@
                 <w:color w:val="211D20"/>
                 <w:sz w:val="16"/>
               </w:rPr>
-              <w:t>Kho nội dung hiện tập trung B1-B2</w:t>
+              <w:t>Chưa có dashboard lỗi hoặc cảnh báo vận hành</w:t>
             </w:r>
           </w:p>
         </w:tc>
@@ -5936,6 +6023,87 @@
                 <w:color w:val="211D20"/>
                 <w:sz w:val="16"/>
               </w:rPr>
+              <w:t>C1 toàn diện</w:t>
+            </w:r>
+          </w:p>
+        </w:tc>
+        <w:tc>
+          <w:tcPr>
+            <w:tcW w:type="dxa" w:w="5540"/>
+            <w:vAlign w:val="center"/>
+            <w:tcMar>
+              <w:top w:w="85" w:type="dxa"/>
+              <w:start w:w="120" w:type="dxa"/>
+              <w:bottom w:w="85" w:type="dxa"/>
+              <w:end w:w="120" w:type="dxa"/>
+            </w:tcMar>
+          </w:tcPr>
+          <w:p>
+            <w:pPr>
+              <w:spacing w:after="0" w:line="264" w:lineRule="auto"/>
+            </w:pPr>
+            <w:r>
+              <w:rPr>
+                <w:rFonts w:ascii="Arial" w:hAnsi="Arial" w:eastAsia="Arial"/>
+                <w:color w:val="211D20"/>
+                <w:sz w:val="16"/>
+              </w:rPr>
+              <w:t>Chưa làm</w:t>
+            </w:r>
+          </w:p>
+        </w:tc>
+        <w:tc>
+          <w:tcPr>
+            <w:tcW w:type="dxa" w:w="1944"/>
+            <w:vAlign w:val="center"/>
+            <w:tcMar>
+              <w:top w:w="85" w:type="dxa"/>
+              <w:start w:w="120" w:type="dxa"/>
+              <w:bottom w:w="85" w:type="dxa"/>
+              <w:end w:w="120" w:type="dxa"/>
+            </w:tcMar>
+          </w:tcPr>
+          <w:p>
+            <w:pPr>
+              <w:spacing w:after="0" w:line="264" w:lineRule="auto"/>
+            </w:pPr>
+            <w:r>
+              <w:rPr>
+                <w:rFonts w:ascii="Arial" w:hAnsi="Arial" w:eastAsia="Arial"/>
+                <w:color w:val="211D20"/>
+                <w:sz w:val="16"/>
+              </w:rPr>
+              <w:t>Kho nội dung hiện tập trung B1-B2</w:t>
+            </w:r>
+          </w:p>
+        </w:tc>
+      </w:tr>
+      <w:tr>
+        <w:trPr>
+          <w:cantSplit/>
+        </w:trPr>
+        <w:tc>
+          <w:tcPr>
+            <w:tcW w:type="dxa" w:w="2236"/>
+            <w:vAlign w:val="center"/>
+            <w:tcMar>
+              <w:top w:w="85" w:type="dxa"/>
+              <w:start w:w="120" w:type="dxa"/>
+              <w:bottom w:w="85" w:type="dxa"/>
+              <w:end w:w="120" w:type="dxa"/>
+            </w:tcMar>
+            <w:shd w:fill="FAF7F8"/>
+          </w:tcPr>
+          <w:p>
+            <w:pPr>
+              <w:spacing w:after="0" w:line="264" w:lineRule="auto"/>
+            </w:pPr>
+            <w:r>
+              <w:rPr>
+                <w:rFonts w:ascii="Arial" w:hAnsi="Arial" w:eastAsia="Arial"/>
+                <w:color w:val="211D20"/>
+                <w:sz w:val="16"/>
+              </w:rPr>
               <w:t>Đa người dùng, quản trị, thanh toán</w:t>
             </w:r>
           </w:p>
@@ -5950,6 +6118,7 @@
               <w:bottom w:w="85" w:type="dxa"/>
               <w:end w:w="120" w:type="dxa"/>
             </w:tcMar>
+            <w:shd w:fill="FAF7F8"/>
           </w:tcPr>
           <w:p>
             <w:pPr>
@@ -5975,6 +6144,7 @@
               <w:bottom w:w="85" w:type="dxa"/>
               <w:end w:w="120" w:type="dxa"/>
             </w:tcMar>
+            <w:shd w:fill="FAF7F8"/>
           </w:tcPr>
           <w:p>
             <w:pPr>
@@ -7007,7 +7177,7 @@
           <w:color w:val="211D20"/>
           <w:sz w:val="20"/>
         </w:rPr>
-        <w:t>Triển khai HTTPS.</w:t>
+        <w:t>Hoàn tất nghiệm thu bản HTTPS.</w:t>
       </w:r>
       <w:r>
         <w:rPr>
@@ -7015,7 +7185,7 @@
           <w:color w:val="211D20"/>
           <w:sz w:val="20"/>
         </w:rPr>
-        <w:t xml:space="preserve"> Chọn nền tảng hỗ trợ Next.js, cấu hình biến môi trường, kiểm tra headers, 404, font và Supabase Auth trên URL thật. Tiêu chí đạt: CI xanh, URL ổn định, login/sync/micro hoạt động và không có secret trong bundle ngoài publishable key.</w:t>
+        <w:t xml:space="preserve"> Vercel pilot, biến môi trường, headers, 404 và font đã kiểm tra. Còn đăng nhập/sync bằng tài khoản thật, micro và kiểm tra không có secret trong bundle ngoài publishable key.</w:t>
       </w:r>
     </w:p>
     <w:p>
@@ -8646,7 +8816,7 @@
           <w:color w:val="211D20"/>
           <w:sz w:val="20"/>
         </w:rPr>
-        <w:t>[ ] Tạo và bàn giao dự án hosting production.</w:t>
+        <w:t>[x] Tạo bản hosting HTTPS pilot trên Vercel và cấu hình biến môi trường Supabase.</w:t>
       </w:r>
     </w:p>
     <w:p>
@@ -8659,7 +8829,7 @@
           <w:color w:val="211D20"/>
           <w:sz w:val="20"/>
         </w:rPr>
-        <w:t>[ ] Cấu hình domain, HTTPS và biến môi trường production.</w:t>
+        <w:t>[ ] Bàn giao quyền truy cập dự án Vercel và chốt tên miền riêng nếu cần.</w:t>
       </w:r>
     </w:p>
     <w:p>
@@ -9035,7 +9205,7 @@
           <w:color w:val="211D20"/>
           <w:sz w:val="20"/>
         </w:rPr>
-        <w:t>Milestone nền tảng được xem là hoàn tất vì các route chính hoạt động, state được bảo toàn, hai chế độ thi chạy hết luồng, Supabase thật đã xác nhận, test production và CI đều đạt, giao diện đã được kiểm tra ở viewport đại diện và tài liệu vận hành đã có. Giai đoạn production chỉ được xem là hoàn tất sau khi có URL HTTPS, nghiệm thu thiết bị thật, thử đồng bộ hai thiết bị và có người chịu trách nhiệm xác nhận chất lượng học liệu.</w:t>
+        <w:t>Milestone nền tảng và hosting kỹ thuật được xem là hoàn tất vì các route chính hoạt động, state được bảo toàn, hai chế độ thi chạy hết luồng, Supabase thật đã xác nhận, URL HTTPS trả đúng status/headers, test production và CI đều đạt. Giai đoạn production vận hành chỉ được xem là hoàn tất sau khi nghiệm thu đăng nhập/sync, micro, thiết bị thật, thử đồng bộ hai thiết bị và có người chịu trách nhiệm xác nhận chất lượng học liệu.</w:t>
       </w:r>
     </w:p>
     <w:tbl>
@@ -9496,7 +9666,7 @@
                 <w:color w:val="211D20"/>
                 <w:sz w:val="16"/>
               </w:rPr>
-              <w:t>Production</w:t>
+              <w:t>Hosting production</w:t>
             </w:r>
           </w:p>
         </w:tc>
@@ -9510,6 +9680,88 @@
               <w:bottom w:w="85" w:type="dxa"/>
               <w:end w:w="120" w:type="dxa"/>
             </w:tcMar>
+          </w:tcPr>
+          <w:p>
+            <w:pPr>
+              <w:spacing w:after="0" w:line="264" w:lineRule="auto"/>
+            </w:pPr>
+            <w:r>
+              <w:rPr>
+                <w:rFonts w:ascii="Arial" w:hAnsi="Arial" w:eastAsia="Arial"/>
+                <w:color w:val="211D20"/>
+                <w:sz w:val="16"/>
+              </w:rPr>
+              <w:t>Đạt kỹ thuật</w:t>
+            </w:r>
+          </w:p>
+        </w:tc>
+        <w:tc>
+          <w:tcPr>
+            <w:tcW w:type="dxa" w:w="1944"/>
+            <w:vAlign w:val="center"/>
+            <w:tcMar>
+              <w:top w:w="85" w:type="dxa"/>
+              <w:start w:w="120" w:type="dxa"/>
+              <w:bottom w:w="85" w:type="dxa"/>
+              <w:end w:w="120" w:type="dxa"/>
+            </w:tcMar>
+          </w:tcPr>
+          <w:p>
+            <w:pPr>
+              <w:spacing w:after="0" w:line="264" w:lineRule="auto"/>
+            </w:pPr>
+            <w:r>
+              <w:rPr>
+                <w:rFonts w:ascii="Arial" w:hAnsi="Arial" w:eastAsia="Arial"/>
+                <w:color w:val="211D20"/>
+                <w:sz w:val="16"/>
+              </w:rPr>
+              <w:t>URL HTTPS, biến môi trường, route/status/header đã kiểm tra</w:t>
+            </w:r>
+          </w:p>
+        </w:tc>
+      </w:tr>
+      <w:tr>
+        <w:trPr>
+          <w:cantSplit/>
+        </w:trPr>
+        <w:tc>
+          <w:tcPr>
+            <w:tcW w:type="dxa" w:w="2236"/>
+            <w:vAlign w:val="center"/>
+            <w:tcMar>
+              <w:top w:w="85" w:type="dxa"/>
+              <w:start w:w="120" w:type="dxa"/>
+              <w:bottom w:w="85" w:type="dxa"/>
+              <w:end w:w="120" w:type="dxa"/>
+            </w:tcMar>
+            <w:shd w:fill="FAF7F8"/>
+          </w:tcPr>
+          <w:p>
+            <w:pPr>
+              <w:spacing w:after="0" w:line="264" w:lineRule="auto"/>
+            </w:pPr>
+            <w:r>
+              <w:rPr>
+                <w:rFonts w:ascii="Arial" w:hAnsi="Arial" w:eastAsia="Arial"/>
+                <w:color w:val="211D20"/>
+                <w:sz w:val="16"/>
+              </w:rPr>
+              <w:t>Production UAT</w:t>
+            </w:r>
+          </w:p>
+        </w:tc>
+        <w:tc>
+          <w:tcPr>
+            <w:tcW w:type="dxa" w:w="5540"/>
+            <w:vAlign w:val="center"/>
+            <w:tcMar>
+              <w:top w:w="85" w:type="dxa"/>
+              <w:start w:w="120" w:type="dxa"/>
+              <w:bottom w:w="85" w:type="dxa"/>
+              <w:end w:w="120" w:type="dxa"/>
+            </w:tcMar>
+            <w:shd w:fill="FAF7F8"/>
           </w:tcPr>
           <w:p>
             <w:pPr>
@@ -9535,6 +9787,7 @@
               <w:bottom w:w="85" w:type="dxa"/>
               <w:end w:w="120" w:type="dxa"/>
             </w:tcMar>
+            <w:shd w:fill="FAF7F8"/>
           </w:tcPr>
           <w:p>
             <w:pPr>
@@ -9546,7 +9799,7 @@
                 <w:color w:val="211D20"/>
                 <w:sz w:val="16"/>
               </w:rPr>
-              <w:t>Cần URL HTTPS, biến môi trường host, kiểm tra hai thiết bị và quy trình vận hành</w:t>
+              <w:t>Cần login/sync thật, micro, hai thiết bị và quy trình vận hành</w:t>
             </w:r>
           </w:p>
         </w:tc>

</xml_diff>

<commit_message>
Refresh handover for accessibility polish
</commit_message>
<xml_diff>
--- a/docs/Bao-cao-ban-giao-May-VSTEP.docx
+++ b/docs/Bao-cao-ban-giao-May-VSTEP.docx
@@ -193,7 +193,7 @@
                 <w:color w:val="211D20"/>
                 <w:sz w:val="18"/>
               </w:rPr>
-              <w:t>9f4d8ea + vòng cải tiến learning loop 10/09/2026</w:t>
+              <w:t>4e0ed58 + vòng polish accessibility 10/09/2026</w:t>
             </w:r>
           </w:p>
         </w:tc>
@@ -630,7 +630,7 @@
           <w:color w:val="211D20"/>
           <w:sz w:val="20"/>
         </w:rPr>
-        <w:t>Mây hiện là một ứng dụng luyện VSTEP cá nhân có kế hoạch học theo ngày, thư viện luyện bốn kỹ năng, hai chế độ thi có giờ, từ vựng, ôn lỗi sai, lịch sử tiến bộ, ghi âm, sao lưu và đồng bộ Supabase thủ công. Giao diện đã được kiểm thử tự động ở viewport máy tính và điện thoại, chuyển sang tone hồng pastel, tối ưu cho tiếng Việt và cá nhân hóa cho Gùa. Bản build, GitHub Actions và smoke test trên URL HTTPS pilot đã đạt; chưa có nghiệm thu trên iOS/Android thật.</w:t>
+        <w:t>Mây hiện là một ứng dụng luyện VSTEP cá nhân có kế hoạch học theo ngày, thư viện luyện bốn kỹ năng, hai chế độ thi có giờ, từ vựng, ôn lỗi sai, lịch sử tiến bộ, ghi âm, sao lưu và đồng bộ Supabase thủ công. Giao diện đã được kiểm thử tự động ở viewport máy tính và điện thoại, chuyển sang tone hồng pastel, tối ưu cho tiếng Việt và cá nhân hóa cho Gùa. Mọi nút tương tác khai báo ngữ nghĩa rõ ràng, bộ lọc có trạng thái đọc được và ứng dụng có màn hình phục hồi cả khi lỗi ở root layout. Bản build, GitHub Actions và smoke test trên URL HTTPS pilot đã đạt; chưa có nghiệm thu trên iOS/Android thật.</w:t>
       </w:r>
     </w:p>
     <w:p>
@@ -4771,7 +4771,7 @@
                 <w:color w:val="211D20"/>
                 <w:sz w:val="16"/>
               </w:rPr>
-              <w:t xml:space="preserve">Run 34435602731 cho commit </w:t>
+              <w:t xml:space="preserve">Run </w:t>
             </w:r>
             <w:r>
               <w:rPr>
@@ -4779,7 +4779,7 @@
                 <w:color w:val="4A3B42"/>
                 <w:sz w:val="15"/>
               </w:rPr>
-              <w:t>32697bf</w:t>
+              <w:t>34446938974</w:t>
             </w:r>
             <w:r>
               <w:rPr>
@@ -4787,7 +4787,7 @@
                 <w:color w:val="211D20"/>
                 <w:sz w:val="16"/>
               </w:rPr>
-              <w:t xml:space="preserve">; run triển khai </w:t>
+              <w:t xml:space="preserve"> cho commit </w:t>
             </w:r>
             <w:r>
               <w:rPr>
@@ -4795,7 +4795,55 @@
                 <w:color w:val="4A3B42"/>
                 <w:sz w:val="15"/>
               </w:rPr>
-              <w:t>34435381574</w:t>
+              <w:t>4e0ed58</w:t>
+            </w:r>
+            <w:r>
+              <w:rPr>
+                <w:rFonts w:ascii="Arial" w:hAnsi="Arial" w:eastAsia="Arial"/>
+                <w:color w:val="211D20"/>
+                <w:sz w:val="16"/>
+              </w:rPr>
+              <w:t xml:space="preserve">; các run </w:t>
+            </w:r>
+            <w:r>
+              <w:rPr>
+                <w:rFonts w:ascii="Consolas" w:hAnsi="Consolas" w:eastAsia="Consolas"/>
+                <w:color w:val="4A3B42"/>
+                <w:sz w:val="15"/>
+              </w:rPr>
+              <w:t>34443900365</w:t>
+            </w:r>
+            <w:r>
+              <w:rPr>
+                <w:rFonts w:ascii="Arial" w:hAnsi="Arial" w:eastAsia="Arial"/>
+                <w:color w:val="211D20"/>
+                <w:sz w:val="16"/>
+              </w:rPr>
+              <w:t xml:space="preserve">, </w:t>
+            </w:r>
+            <w:r>
+              <w:rPr>
+                <w:rFonts w:ascii="Consolas" w:hAnsi="Consolas" w:eastAsia="Consolas"/>
+                <w:color w:val="4A3B42"/>
+                <w:sz w:val="15"/>
+              </w:rPr>
+              <w:t>34439806721</w:t>
+            </w:r>
+            <w:r>
+              <w:rPr>
+                <w:rFonts w:ascii="Arial" w:hAnsi="Arial" w:eastAsia="Arial"/>
+                <w:color w:val="211D20"/>
+                <w:sz w:val="16"/>
+              </w:rPr>
+              <w:t xml:space="preserve">, </w:t>
+            </w:r>
+            <w:r>
+              <w:rPr>
+                <w:rFonts w:ascii="Consolas" w:hAnsi="Consolas" w:eastAsia="Consolas"/>
+                <w:color w:val="4A3B42"/>
+                <w:sz w:val="15"/>
+              </w:rPr>
+              <w:t>34435602731</w:t>
             </w:r>
             <w:r>
               <w:rPr>
@@ -7669,7 +7717,7 @@
                 <w:color w:val="211D20"/>
                 <w:sz w:val="16"/>
               </w:rPr>
-              <w:t>Route, metadata, layout, error và not-found</w:t>
+              <w:t>Route, metadata, layout, error, global-error và not-found</w:t>
             </w:r>
           </w:p>
         </w:tc>
@@ -9174,6 +9222,230 @@
           </w:p>
         </w:tc>
       </w:tr>
+      <w:tr>
+        <w:trPr>
+          <w:cantSplit/>
+        </w:trPr>
+        <w:tc>
+          <w:tcPr>
+            <w:tcW w:type="dxa" w:w="3013"/>
+            <w:vAlign w:val="center"/>
+            <w:tcMar>
+              <w:top w:w="85" w:type="dxa"/>
+              <w:start w:w="120" w:type="dxa"/>
+              <w:bottom w:w="85" w:type="dxa"/>
+              <w:end w:w="120" w:type="dxa"/>
+            </w:tcMar>
+          </w:tcPr>
+          <w:p>
+            <w:pPr>
+              <w:spacing w:after="0" w:line="264" w:lineRule="auto"/>
+            </w:pPr>
+            <w:r>
+              <w:rPr>
+                <w:rFonts w:ascii="Consolas" w:hAnsi="Consolas" w:eastAsia="Consolas"/>
+                <w:color w:val="4A3B42"/>
+                <w:sz w:val="15"/>
+              </w:rPr>
+              <w:t>13e6683</w:t>
+            </w:r>
+          </w:p>
+        </w:tc>
+        <w:tc>
+          <w:tcPr>
+            <w:tcW w:type="dxa" w:w="6707"/>
+            <w:vAlign w:val="center"/>
+            <w:tcMar>
+              <w:top w:w="85" w:type="dxa"/>
+              <w:start w:w="120" w:type="dxa"/>
+              <w:bottom w:w="85" w:type="dxa"/>
+              <w:end w:w="120" w:type="dxa"/>
+            </w:tcMar>
+          </w:tcPr>
+          <w:p>
+            <w:pPr>
+              <w:spacing w:after="0" w:line="264" w:lineRule="auto"/>
+            </w:pPr>
+            <w:r>
+              <w:rPr>
+                <w:rFonts w:ascii="Arial" w:hAnsi="Arial" w:eastAsia="Arial"/>
+                <w:color w:val="211D20"/>
+                <w:sz w:val="16"/>
+              </w:rPr>
+              <w:t>Thêm mức tự tin, ưu tiên lỗi sai và Daily Mission v2</w:t>
+            </w:r>
+          </w:p>
+        </w:tc>
+      </w:tr>
+      <w:tr>
+        <w:trPr>
+          <w:cantSplit/>
+        </w:trPr>
+        <w:tc>
+          <w:tcPr>
+            <w:tcW w:type="dxa" w:w="3013"/>
+            <w:vAlign w:val="center"/>
+            <w:tcMar>
+              <w:top w:w="85" w:type="dxa"/>
+              <w:start w:w="120" w:type="dxa"/>
+              <w:bottom w:w="85" w:type="dxa"/>
+              <w:end w:w="120" w:type="dxa"/>
+            </w:tcMar>
+            <w:shd w:fill="FAF7F8"/>
+          </w:tcPr>
+          <w:p>
+            <w:pPr>
+              <w:spacing w:after="0" w:line="264" w:lineRule="auto"/>
+            </w:pPr>
+            <w:r>
+              <w:rPr>
+                <w:rFonts w:ascii="Consolas" w:hAnsi="Consolas" w:eastAsia="Consolas"/>
+                <w:color w:val="4A3B42"/>
+                <w:sz w:val="15"/>
+              </w:rPr>
+              <w:t>343a02f</w:t>
+            </w:r>
+          </w:p>
+        </w:tc>
+        <w:tc>
+          <w:tcPr>
+            <w:tcW w:type="dxa" w:w="6707"/>
+            <w:vAlign w:val="center"/>
+            <w:tcMar>
+              <w:top w:w="85" w:type="dxa"/>
+              <w:start w:w="120" w:type="dxa"/>
+              <w:bottom w:w="85" w:type="dxa"/>
+              <w:end w:w="120" w:type="dxa"/>
+            </w:tcMar>
+            <w:shd w:fill="FAF7F8"/>
+          </w:tcPr>
+          <w:p>
+            <w:pPr>
+              <w:spacing w:after="0" w:line="264" w:lineRule="auto"/>
+            </w:pPr>
+            <w:r>
+              <w:rPr>
+                <w:rFonts w:ascii="Arial" w:hAnsi="Arial" w:eastAsia="Arial"/>
+                <w:color w:val="211D20"/>
+                <w:sz w:val="16"/>
+              </w:rPr>
+              <w:t>Đồng bộ báo cáo bàn giao với HTTPS pilot đã xác thực</w:t>
+            </w:r>
+          </w:p>
+        </w:tc>
+      </w:tr>
+      <w:tr>
+        <w:trPr>
+          <w:cantSplit/>
+        </w:trPr>
+        <w:tc>
+          <w:tcPr>
+            <w:tcW w:type="dxa" w:w="3013"/>
+            <w:vAlign w:val="center"/>
+            <w:tcMar>
+              <w:top w:w="85" w:type="dxa"/>
+              <w:start w:w="120" w:type="dxa"/>
+              <w:bottom w:w="85" w:type="dxa"/>
+              <w:end w:w="120" w:type="dxa"/>
+            </w:tcMar>
+          </w:tcPr>
+          <w:p>
+            <w:pPr>
+              <w:spacing w:after="0" w:line="264" w:lineRule="auto"/>
+            </w:pPr>
+            <w:r>
+              <w:rPr>
+                <w:rFonts w:ascii="Consolas" w:hAnsi="Consolas" w:eastAsia="Consolas"/>
+                <w:color w:val="4A3B42"/>
+                <w:sz w:val="15"/>
+              </w:rPr>
+              <w:t>867cb68</w:t>
+            </w:r>
+          </w:p>
+        </w:tc>
+        <w:tc>
+          <w:tcPr>
+            <w:tcW w:type="dxa" w:w="6707"/>
+            <w:vAlign w:val="center"/>
+            <w:tcMar>
+              <w:top w:w="85" w:type="dxa"/>
+              <w:start w:w="120" w:type="dxa"/>
+              <w:bottom w:w="85" w:type="dxa"/>
+              <w:end w:w="120" w:type="dxa"/>
+            </w:tcMar>
+          </w:tcPr>
+          <w:p>
+            <w:pPr>
+              <w:spacing w:after="0" w:line="264" w:lineRule="auto"/>
+            </w:pPr>
+            <w:r>
+              <w:rPr>
+                <w:rFonts w:ascii="Arial" w:hAnsi="Arial" w:eastAsia="Arial"/>
+                <w:color w:val="211D20"/>
+                <w:sz w:val="16"/>
+              </w:rPr>
+              <w:t>Thêm màn hình phục hồi khi root layout gặp lỗi</w:t>
+            </w:r>
+          </w:p>
+        </w:tc>
+      </w:tr>
+      <w:tr>
+        <w:trPr>
+          <w:cantSplit/>
+        </w:trPr>
+        <w:tc>
+          <w:tcPr>
+            <w:tcW w:type="dxa" w:w="3013"/>
+            <w:vAlign w:val="center"/>
+            <w:tcMar>
+              <w:top w:w="85" w:type="dxa"/>
+              <w:start w:w="120" w:type="dxa"/>
+              <w:bottom w:w="85" w:type="dxa"/>
+              <w:end w:w="120" w:type="dxa"/>
+            </w:tcMar>
+            <w:shd w:fill="FAF7F8"/>
+          </w:tcPr>
+          <w:p>
+            <w:pPr>
+              <w:spacing w:after="0" w:line="264" w:lineRule="auto"/>
+            </w:pPr>
+            <w:r>
+              <w:rPr>
+                <w:rFonts w:ascii="Consolas" w:hAnsi="Consolas" w:eastAsia="Consolas"/>
+                <w:color w:val="4A3B42"/>
+                <w:sz w:val="15"/>
+              </w:rPr>
+              <w:t>4e0ed58</w:t>
+            </w:r>
+          </w:p>
+        </w:tc>
+        <w:tc>
+          <w:tcPr>
+            <w:tcW w:type="dxa" w:w="6707"/>
+            <w:vAlign w:val="center"/>
+            <w:tcMar>
+              <w:top w:w="85" w:type="dxa"/>
+              <w:start w:w="120" w:type="dxa"/>
+              <w:bottom w:w="85" w:type="dxa"/>
+              <w:end w:w="120" w:type="dxa"/>
+            </w:tcMar>
+            <w:shd w:fill="FAF7F8"/>
+          </w:tcPr>
+          <w:p>
+            <w:pPr>
+              <w:spacing w:after="0" w:line="264" w:lineRule="auto"/>
+            </w:pPr>
+            <w:r>
+              <w:rPr>
+                <w:rFonts w:ascii="Arial" w:hAnsi="Arial" w:eastAsia="Arial"/>
+                <w:color w:val="211D20"/>
+                <w:sz w:val="16"/>
+              </w:rPr>
+              <w:t>Chuẩn hóa ngữ nghĩa nút, bộ lọc, timer và cập nhật trạng thái trợ năng</w:t>
+            </w:r>
+          </w:p>
+        </w:tc>
+      </w:tr>
     </w:tbl>
     <w:p>
       <w:pPr>

</xml_diff>

<commit_message>
feat: deepen reading and listening feedback
</commit_message>
<xml_diff>
--- a/docs/Bao-cao-ban-giao-May-VSTEP.docx
+++ b/docs/Bao-cao-ban-giao-May-VSTEP.docx
@@ -193,7 +193,7 @@
                 <w:color w:val="211D20"/>
                 <w:sz w:val="18"/>
               </w:rPr>
-              <w:t>4e0ed58 + vòng polish accessibility 10/09/2026</w:t>
+              <w:t>Hoàn thiện Reading và Listening 10/09/2026</w:t>
             </w:r>
           </w:p>
         </w:tc>
@@ -443,7 +443,7 @@
           <w:color w:val="211D20"/>
           <w:sz w:val="22"/>
         </w:rPr>
-        <w:t>Bản code hiện đủ để Gùa pilot hằng ngày trên URL HTTPS hoặc local, Supabase thật đã kết nối và toàn bộ pipeline kiểm tra đang đạt. Daily Mission đã giải thích lý do chọn bài và ưu tiên lỗi đến hạn hoặc sai với mức tự tin cao. Các điều kiện còn thiếu để nghiệm thu production là login/sync trên bản host, micro và thiết bị thật, thử đồng bộ hai thiết bị cùng thẩm định học liệu bởi giáo viên VSTEP.</w:t>
+        <w:t>Bản code hiện đủ để Gùa pilot hằng ngày trên URL HTTPS hoặc local, Supabase thật đã kết nối và toàn bộ pipeline kiểm tra đang đạt. Reading và Listening có phản hồi theo dạng câu cùng độ chắc chắn; transcript chỉ mở sau khi nộp. Các điều kiện còn thiếu để nghiệm thu production là login/sync trên bản host, micro và thiết bị thật, thử đồng bộ hai thiết bị cùng thẩm định học liệu bởi giáo viên VSTEP.</w:t>
       </w:r>
     </w:p>
     <w:p>
@@ -630,7 +630,7 @@
           <w:color w:val="211D20"/>
           <w:sz w:val="20"/>
         </w:rPr>
-        <w:t>Mây hiện là một ứng dụng luyện VSTEP cá nhân có kế hoạch học theo ngày, thư viện luyện bốn kỹ năng, hai chế độ thi có giờ, từ vựng, ôn lỗi sai, lịch sử tiến bộ, ghi âm, sao lưu và đồng bộ Supabase thủ công. Giao diện đã được kiểm thử tự động ở viewport máy tính và điện thoại, chuyển sang tone hồng pastel, tối ưu cho tiếng Việt và cá nhân hóa cho Gùa. Mọi nút tương tác khai báo ngữ nghĩa rõ ràng, bộ lọc có trạng thái đọc được và ứng dụng có màn hình phục hồi cả khi lỗi ở root layout. Bản build, GitHub Actions và smoke test trên URL HTTPS pilot đã đạt; chưa có nghiệm thu trên iOS/Android thật.</w:t>
+        <w:t>Mây hiện là một ứng dụng luyện VSTEP cá nhân có kế hoạch học theo ngày, thư viện luyện bốn kỹ năng, hai chế độ thi có giờ, từ vựng, ôn lỗi sai, lịch sử tiến bộ, ghi âm, sao lưu và đồng bộ Supabase thủ công. Reading/Listening đã có phản hồi theo dạng câu và độ chắc chắn; phần thi có giờ cảnh báo câu bỏ trống và chỉ mở transcript Listening sau khi hoàn thành. Giao diện đã được kiểm thử tự động ở viewport máy tính và điện thoại, chuyển sang tone hồng pastel, tối ưu cho tiếng Việt và cá nhân hóa cho Gùa. Mọi nút tương tác khai báo ngữ nghĩa rõ ràng, bộ lọc có trạng thái đọc được và ứng dụng có màn hình phục hồi cả khi lỗi ở root layout. Bản build, GitHub Actions và smoke test trên URL HTTPS pilot đã đạt; chưa có nghiệm thu trên iOS/Android thật.</w:t>
       </w:r>
     </w:p>
     <w:p>
@@ -1122,7 +1122,7 @@
                 <w:color w:val="211D20"/>
                 <w:sz w:val="16"/>
               </w:rPr>
-              <w:t>Câu sai được gom theo subskill, số lần sai và mức chắc chắn; lỗi “sai nhưng rất chắc” được ưu tiên, yêu cầu làm lại trước khi xem giải thích và có lịch ôn</w:t>
+              <w:t>Kết quả tách theo dạng câu và độ chắc chắn; câu sai được gom theo subskill, số lần sai; lỗi “sai nhưng rất chắc” được ưu tiên, yêu cầu làm lại và có lịch ôn</w:t>
             </w:r>
           </w:p>
         </w:tc>
@@ -1147,7 +1147,7 @@
                 <w:color w:val="211D20"/>
                 <w:sz w:val="16"/>
               </w:rPr>
-              <w:t>Hoàn thành bản taxonomy đầu tiên</w:t>
+              <w:t>Hoàn thành vòng phản hồi đầu tiên</w:t>
             </w:r>
           </w:p>
         </w:tc>
@@ -1891,7 +1891,7 @@
           <w:color w:val="211D20"/>
           <w:sz w:val="20"/>
         </w:rPr>
-        <w:t>Bài Đọc/Nghe có câu hỏi, đáp án, giải thích và chấm điểm chính xác.</w:t>
+        <w:t>Bài Đọc/Nghe có câu hỏi, đáp án, giải thích, chấm điểm chính xác và chẩn đoán theo dạng câu cùng mức chắc chắn.</w:t>
       </w:r>
     </w:p>
     <w:p>
@@ -2014,6 +2014,19 @@
           <w:sz w:val="20"/>
         </w:rPr>
         <w:t>Tự lưu đáp án, hai bài Viết và bản ghi từng phần Nói.</w:t>
+      </w:r>
+    </w:p>
+    <w:p>
+      <w:pPr>
+        <w:pStyle w:val="ListBullet"/>
+      </w:pPr>
+      <w:r>
+        <w:rPr>
+          <w:rFonts w:ascii="Arial" w:hAnsi="Arial" w:eastAsia="Arial"/>
+          <w:color w:val="211D20"/>
+          <w:sz w:val="20"/>
+        </w:rPr>
+        <w:t>Báo rõ số câu Nghe/Đọc còn bỏ trống trước khi nộp; transcript Nghe chỉ xuất hiện trong phần đối chiếu sau khi hoàn thành.</w:t>
       </w:r>
     </w:p>
     <w:p>
@@ -4329,7 +4342,7 @@
                 <w:color w:val="211D20"/>
                 <w:sz w:val="16"/>
               </w:rPr>
-              <w:t>46/46 đạt</w:t>
+              <w:t>47/47 đạt</w:t>
             </w:r>
           </w:p>
         </w:tc>
@@ -4354,7 +4367,7 @@
                 <w:color w:val="211D20"/>
                 <w:sz w:val="16"/>
               </w:rPr>
-              <w:t>Logic học, confidence, planner, lịch ôn, chấm điểm, timer, store, speech, đề và migration SQL/RLS</w:t>
+              <w:t>Logic học, confidence, chẩn đoán dạng câu, planner, lịch ôn, timer, store, speech, đề và SQL/RLS</w:t>
             </w:r>
           </w:p>
         </w:tc>
@@ -4927,7 +4940,7 @@
           <w:color w:val="211D20"/>
           <w:sz w:val="20"/>
         </w:rPr>
-        <w:t>Các kiểm thử đáng chú ý bao gồm: khôi phục deadline sau reload, lưu hai bài Viết riêng, lưu bản ghi Nói khi chuyển phần, chống mất đáp án giữa hai tab, giữ localStorage hỏng, từ chối micro, backup không hợp lệ, bảo vệ HTTP headers, 404 thật, custom cursor, mobile 390 px và trang kết quả đề đủ cấu trúc.</w:t>
+        <w:t>Các kiểm thử đáng chú ý bao gồm: chẩn đoán Reading theo dạng câu và confidence, transcript Listening sau khi nộp, khôi phục deadline sau reload, lưu hai bài Viết riêng, lưu bản ghi Nói khi chuyển phần, chống mất đáp án giữa hai tab, giữ localStorage hỏng, từ chối micro, backup không hợp lệ, bảo vệ HTTP headers, 404 thật, custom cursor, mobile 390 px và trang kết quả đề đủ cấu trúc.</w:t>
       </w:r>
     </w:p>
     <w:p>

</xml_diff>

<commit_message>
docs: refresh production verification
</commit_message>
<xml_diff>
--- a/docs/Bao-cao-ban-giao-May-VSTEP.docx
+++ b/docs/Bao-cao-ban-giao-May-VSTEP.docx
@@ -139,7 +139,7 @@
                 <w:color w:val="211D20"/>
                 <w:sz w:val="18"/>
               </w:rPr>
-              <w:t>10/09/2026</w:t>
+              <w:t>11/09/2026</w:t>
             </w:r>
           </w:p>
         </w:tc>
@@ -193,7 +193,7 @@
                 <w:color w:val="211D20"/>
                 <w:sz w:val="18"/>
               </w:rPr>
-              <w:t>Hoàn thiện Reading và Listening 10/09/2026</w:t>
+              <w:t>Kiểm định production Reading và Listening 11/09/2026</w:t>
             </w:r>
           </w:p>
         </w:tc>
@@ -4701,7 +4701,7 @@
                 <w:color w:val="211D20"/>
                 <w:sz w:val="16"/>
               </w:rPr>
-              <w:t xml:space="preserve"> ngày 10/09/2026</w:t>
+              <w:t xml:space="preserve"> ngày 11/09/2026</w:t>
             </w:r>
           </w:p>
         </w:tc>
@@ -4792,7 +4792,7 @@
                 <w:color w:val="4A3B42"/>
                 <w:sz w:val="15"/>
               </w:rPr>
-              <w:t>34446938974</w:t>
+              <w:t>34462704547</w:t>
             </w:r>
             <w:r>
               <w:rPr>
@@ -4808,7 +4808,7 @@
                 <w:color w:val="4A3B42"/>
                 <w:sz w:val="15"/>
               </w:rPr>
-              <w:t>4e0ed58</w:t>
+              <w:t>ddf3eb7</w:t>
             </w:r>
             <w:r>
               <w:rPr>
@@ -4816,7 +4816,7 @@
                 <w:color w:val="211D20"/>
                 <w:sz w:val="16"/>
               </w:rPr>
-              <w:t xml:space="preserve">; các run </w:t>
+              <w:t xml:space="preserve">; run </w:t>
             </w:r>
             <w:r>
               <w:rPr>
@@ -4824,7 +4824,7 @@
                 <w:color w:val="4A3B42"/>
                 <w:sz w:val="15"/>
               </w:rPr>
-              <w:t>34443900365</w:t>
+              <w:t>34462044646</w:t>
             </w:r>
             <w:r>
               <w:rPr>
@@ -4832,7 +4832,7 @@
                 <w:color w:val="211D20"/>
                 <w:sz w:val="16"/>
               </w:rPr>
-              <w:t xml:space="preserve">, </w:t>
+              <w:t xml:space="preserve"> cho commit </w:t>
             </w:r>
             <w:r>
               <w:rPr>
@@ -4840,23 +4840,7 @@
                 <w:color w:val="4A3B42"/>
                 <w:sz w:val="15"/>
               </w:rPr>
-              <w:t>34439806721</w:t>
-            </w:r>
-            <w:r>
-              <w:rPr>
-                <w:rFonts w:ascii="Arial" w:hAnsi="Arial" w:eastAsia="Arial"/>
-                <w:color w:val="211D20"/>
-                <w:sz w:val="16"/>
-              </w:rPr>
-              <w:t xml:space="preserve">, </w:t>
-            </w:r>
-            <w:r>
-              <w:rPr>
-                <w:rFonts w:ascii="Consolas" w:hAnsi="Consolas" w:eastAsia="Consolas"/>
-                <w:color w:val="4A3B42"/>
-                <w:sz w:val="15"/>
-              </w:rPr>
-              <w:t>34435602731</w:t>
+              <w:t>80e6672</w:t>
             </w:r>
             <w:r>
               <w:rPr>
@@ -5156,7 +5140,7 @@
                 <w:color w:val="211D20"/>
                 <w:sz w:val="16"/>
               </w:rPr>
-              <w:t>; 10 route 200, 404 và headers đã smoke test</w:t>
+              <w:t>; 9 màn chính, 14 bài luyện, 404 và headers đã kiểm tra</w:t>
             </w:r>
           </w:p>
         </w:tc>
@@ -9459,6 +9443,118 @@
           </w:p>
         </w:tc>
       </w:tr>
+      <w:tr>
+        <w:trPr>
+          <w:cantSplit/>
+        </w:trPr>
+        <w:tc>
+          <w:tcPr>
+            <w:tcW w:type="dxa" w:w="3013"/>
+            <w:vAlign w:val="center"/>
+            <w:tcMar>
+              <w:top w:w="85" w:type="dxa"/>
+              <w:start w:w="120" w:type="dxa"/>
+              <w:bottom w:w="85" w:type="dxa"/>
+              <w:end w:w="120" w:type="dxa"/>
+            </w:tcMar>
+          </w:tcPr>
+          <w:p>
+            <w:pPr>
+              <w:spacing w:after="0" w:line="264" w:lineRule="auto"/>
+            </w:pPr>
+            <w:r>
+              <w:rPr>
+                <w:rFonts w:ascii="Consolas" w:hAnsi="Consolas" w:eastAsia="Consolas"/>
+                <w:color w:val="4A3B42"/>
+                <w:sz w:val="15"/>
+              </w:rPr>
+              <w:t>80e6672</w:t>
+            </w:r>
+          </w:p>
+        </w:tc>
+        <w:tc>
+          <w:tcPr>
+            <w:tcW w:type="dxa" w:w="6707"/>
+            <w:vAlign w:val="center"/>
+            <w:tcMar>
+              <w:top w:w="85" w:type="dxa"/>
+              <w:start w:w="120" w:type="dxa"/>
+              <w:bottom w:w="85" w:type="dxa"/>
+              <w:end w:w="120" w:type="dxa"/>
+            </w:tcMar>
+          </w:tcPr>
+          <w:p>
+            <w:pPr>
+              <w:spacing w:after="0" w:line="264" w:lineRule="auto"/>
+            </w:pPr>
+            <w:r>
+              <w:rPr>
+                <w:rFonts w:ascii="Arial" w:hAnsi="Arial" w:eastAsia="Arial"/>
+                <w:color w:val="211D20"/>
+                <w:sz w:val="16"/>
+              </w:rPr>
+              <w:t>Thêm phản hồi sâu cho Reading/Listening và hoàn thiện luồng đối chiếu sau khi nộp</w:t>
+            </w:r>
+          </w:p>
+        </w:tc>
+      </w:tr>
+      <w:tr>
+        <w:trPr>
+          <w:cantSplit/>
+        </w:trPr>
+        <w:tc>
+          <w:tcPr>
+            <w:tcW w:type="dxa" w:w="3013"/>
+            <w:vAlign w:val="center"/>
+            <w:tcMar>
+              <w:top w:w="85" w:type="dxa"/>
+              <w:start w:w="120" w:type="dxa"/>
+              <w:bottom w:w="85" w:type="dxa"/>
+              <w:end w:w="120" w:type="dxa"/>
+            </w:tcMar>
+            <w:shd w:fill="FAF7F8"/>
+          </w:tcPr>
+          <w:p>
+            <w:pPr>
+              <w:spacing w:after="0" w:line="264" w:lineRule="auto"/>
+            </w:pPr>
+            <w:r>
+              <w:rPr>
+                <w:rFonts w:ascii="Consolas" w:hAnsi="Consolas" w:eastAsia="Consolas"/>
+                <w:color w:val="4A3B42"/>
+                <w:sz w:val="15"/>
+              </w:rPr>
+              <w:t>ddf3eb7</w:t>
+            </w:r>
+          </w:p>
+        </w:tc>
+        <w:tc>
+          <w:tcPr>
+            <w:tcW w:type="dxa" w:w="6707"/>
+            <w:vAlign w:val="center"/>
+            <w:tcMar>
+              <w:top w:w="85" w:type="dxa"/>
+              <w:start w:w="120" w:type="dxa"/>
+              <w:bottom w:w="85" w:type="dxa"/>
+              <w:end w:w="120" w:type="dxa"/>
+            </w:tcMar>
+            <w:shd w:fill="FAF7F8"/>
+          </w:tcPr>
+          <w:p>
+            <w:pPr>
+              <w:spacing w:after="0" w:line="264" w:lineRule="auto"/>
+            </w:pPr>
+            <w:r>
+              <w:rPr>
+                <w:rFonts w:ascii="Arial" w:hAnsi="Arial" w:eastAsia="Arial"/>
+                <w:color w:val="211D20"/>
+                <w:sz w:val="16"/>
+              </w:rPr>
+              <w:t>Bổ sung Content Security Policy cho bản production</w:t>
+            </w:r>
+          </w:p>
+        </w:tc>
+      </w:tr>
     </w:tbl>
     <w:p>
       <w:pPr>

</xml_diff>

<commit_message>
perf: harden cross-browser production
</commit_message>
<xml_diff>
--- a/docs/Bao-cao-ban-giao-May-VSTEP.docx
+++ b/docs/Bao-cao-ban-giao-May-VSTEP.docx
@@ -443,7 +443,7 @@
           <w:color w:val="211D20"/>
           <w:sz w:val="22"/>
         </w:rPr>
-        <w:t>Bản code hiện đủ để Gùa pilot hằng ngày trên URL HTTPS hoặc local, Supabase thật đã kết nối và toàn bộ pipeline kiểm tra đang đạt. Reading và Listening có phản hồi theo dạng câu cùng độ chắc chắn; transcript chỉ mở sau khi nộp. Các điều kiện còn thiếu để nghiệm thu production là login/sync trên bản host, micro và thiết bị thật, thử đồng bộ hai thiết bị cùng thẩm định học liệu bởi giáo viên VSTEP.</w:t>
+        <w:t>Bản code hiện đủ để Gùa pilot hằng ngày trên URL HTTPS hoặc local, Supabase thật đã kết nối và toàn bộ pipeline kiểm tra đang đạt. Reading và Listening có phản hồi theo dạng câu cùng độ chắc chắn; transcript chỉ mở sau khi nộp. Bộ kiểm thử production gồm 47 unit test và 27 E2E trên Chromium, Firefox, WebKit. Các điều kiện còn thiếu để nghiệm thu vận hành là login/sync trên bản host, micro và thiết bị thật, thử đồng bộ hai thiết bị cùng thẩm định học liệu bởi giáo viên VSTEP.</w:t>
       </w:r>
     </w:p>
     <w:p>
@@ -630,7 +630,7 @@
           <w:color w:val="211D20"/>
           <w:sz w:val="20"/>
         </w:rPr>
-        <w:t>Mây hiện là một ứng dụng luyện VSTEP cá nhân có kế hoạch học theo ngày, thư viện luyện bốn kỹ năng, hai chế độ thi có giờ, từ vựng, ôn lỗi sai, lịch sử tiến bộ, ghi âm, sao lưu và đồng bộ Supabase thủ công. Reading/Listening đã có phản hồi theo dạng câu và độ chắc chắn; phần thi có giờ cảnh báo câu bỏ trống và chỉ mở transcript Listening sau khi hoàn thành. Giao diện đã được kiểm thử tự động ở viewport máy tính và điện thoại, chuyển sang tone hồng pastel, tối ưu cho tiếng Việt và cá nhân hóa cho Gùa. Mọi nút tương tác khai báo ngữ nghĩa rõ ràng, bộ lọc có trạng thái đọc được và ứng dụng có màn hình phục hồi cả khi lỗi ở root layout. Bản build, GitHub Actions và smoke test trên URL HTTPS pilot đã đạt; chưa có nghiệm thu trên iOS/Android thật.</w:t>
+        <w:t>Mây hiện là một ứng dụng luyện VSTEP cá nhân có kế hoạch học theo ngày, thư viện luyện bốn kỹ năng, hai chế độ thi có giờ, từ vựng, ôn lỗi sai, lịch sử tiến bộ, ghi âm, sao lưu và đồng bộ Supabase thủ công. Reading/Listening đã có phản hồi theo dạng câu và độ chắc chắn; phần thi có giờ cảnh báo câu bỏ trống và chỉ mở transcript Listening sau khi hoàn thành. Giao diện đã được kiểm thử tự động ở viewport máy tính và điện thoại, chuyển sang tone hồng pastel, tối ưu cho tiếng Việt và cá nhân hóa cho Gùa. Mọi nút tương tác khai báo ngữ nghĩa rõ ràng, bộ lọc có trạng thái đọc được và ứng dụng có màn hình phục hồi cả khi lỗi ở root layout. Bản build, GitHub Actions và smoke test trên URL HTTPS pilot đã đạt; luồng Reading/Listening trọng yếu cũng đạt trên Chromium, Firefox và WebKit. Chưa có nghiệm thu trên iOS/Android thật.</w:t>
       </w:r>
     </w:p>
     <w:p>
@@ -2401,6 +2401,19 @@
     </w:p>
     <w:p>
       <w:pPr>
+        <w:pStyle w:val="ListBullet"/>
+      </w:pPr>
+      <w:r>
+        <w:rPr>
+          <w:rFonts w:ascii="Arial" w:hAnsi="Arial" w:eastAsia="Arial"/>
+          <w:color w:val="211D20"/>
+          <w:sz w:val="20"/>
+        </w:rPr>
+        <w:t>Có web app manifest, màu theme và metadata cho màn hình chính; chưa có service worker nên không cam kết offline đầy đủ.</w:t>
+      </w:r>
+    </w:p>
+    <w:p>
+      <w:pPr>
         <w:pStyle w:val="Heading1"/>
       </w:pPr>
       <w:r>
@@ -2908,7 +2921,7 @@
                 <w:color w:val="211D20"/>
                 <w:sz w:val="16"/>
               </w:rPr>
-              <w:t>Zod 4.5.4</w:t>
+              <w:t>Zod Mini 4.5.4</w:t>
             </w:r>
           </w:p>
         </w:tc>
@@ -4424,7 +4437,7 @@
                 <w:color w:val="211D20"/>
                 <w:sz w:val="16"/>
               </w:rPr>
-              <w:t>23/23 đạt</w:t>
+              <w:t>27/27 đạt</w:t>
             </w:r>
           </w:p>
         </w:tc>
@@ -4450,7 +4463,7 @@
                 <w:color w:val="211D20"/>
                 <w:sz w:val="16"/>
               </w:rPr>
-              <w:t>Các route chính, reload, nhiều tab, thi đủ cấu trúc, import/export, micro, responsive và lỗi lưu</w:t>
+              <w:t>25 ca Chromium; smoke Reading/Listening trên Firefox và WebKit, CSP, manifest và responsive</w:t>
             </w:r>
           </w:p>
         </w:tc>
@@ -4613,7 +4626,7 @@
                 <w:color w:val="211D20"/>
                 <w:sz w:val="16"/>
               </w:rPr>
-              <w:t>44 trang tĩnh/SSG được sinh thành công</w:t>
+              <w:t>45 route tĩnh/SSG được sinh thành công, gồm web app manifest</w:t>
             </w:r>
           </w:p>
         </w:tc>
@@ -4792,7 +4805,7 @@
                 <w:color w:val="4A3B42"/>
                 <w:sz w:val="15"/>
               </w:rPr>
-              <w:t>34462704547</w:t>
+              <w:t>34604727728</w:t>
             </w:r>
             <w:r>
               <w:rPr>
@@ -4808,7 +4821,7 @@
                 <w:color w:val="4A3B42"/>
                 <w:sz w:val="15"/>
               </w:rPr>
-              <w:t>ddf3eb7</w:t>
+              <w:t>7b78df6</w:t>
             </w:r>
             <w:r>
               <w:rPr>
@@ -4816,39 +4829,7 @@
                 <w:color w:val="211D20"/>
                 <w:sz w:val="16"/>
               </w:rPr>
-              <w:t xml:space="preserve">; run </w:t>
-            </w:r>
-            <w:r>
-              <w:rPr>
-                <w:rFonts w:ascii="Consolas" w:hAnsi="Consolas" w:eastAsia="Consolas"/>
-                <w:color w:val="4A3B42"/>
-                <w:sz w:val="15"/>
-              </w:rPr>
-              <w:t>34462044646</w:t>
-            </w:r>
-            <w:r>
-              <w:rPr>
-                <w:rFonts w:ascii="Arial" w:hAnsi="Arial" w:eastAsia="Arial"/>
-                <w:color w:val="211D20"/>
-                <w:sz w:val="16"/>
-              </w:rPr>
-              <w:t xml:space="preserve"> cho commit </w:t>
-            </w:r>
-            <w:r>
-              <w:rPr>
-                <w:rFonts w:ascii="Consolas" w:hAnsi="Consolas" w:eastAsia="Consolas"/>
-                <w:color w:val="4A3B42"/>
-                <w:sz w:val="15"/>
-              </w:rPr>
-              <w:t>80e6672</w:t>
-            </w:r>
-            <w:r>
-              <w:rPr>
-                <w:rFonts w:ascii="Arial" w:hAnsi="Arial" w:eastAsia="Arial"/>
-                <w:color w:val="211D20"/>
-                <w:sz w:val="16"/>
-              </w:rPr>
-              <w:t xml:space="preserve"> cũng đạt</w:t>
+              <w:t>; pipeline hiện cài Chromium, Firefox và WebKit</w:t>
             </w:r>
           </w:p>
         </w:tc>
@@ -4898,7 +4879,7 @@
           <w:color w:val="211D20"/>
           <w:sz w:val="20"/>
         </w:rPr>
-        <w:t xml:space="preserve">, cài Chromium và chạy bộ Playwright trên </w:t>
+        <w:t xml:space="preserve">, cài Chromium, Firefox, WebKit và chạy bộ Playwright trên </w:t>
       </w:r>
       <w:r>
         <w:rPr>
@@ -4924,7 +4905,49 @@
           <w:color w:val="211D20"/>
           <w:sz w:val="20"/>
         </w:rPr>
-        <w:t>Các kiểm thử đáng chú ý bao gồm: chẩn đoán Reading theo dạng câu và confidence, transcript Listening sau khi nộp, khôi phục deadline sau reload, lưu hai bài Viết riêng, lưu bản ghi Nói khi chuyển phần, chống mất đáp án giữa hai tab, giữ localStorage hỏng, từ chối micro, backup không hợp lệ, bảo vệ HTTP headers, 404 thật, custom cursor, mobile 390 px và trang kết quả đề đủ cấu trúc.</w:t>
+        <w:t>Các kiểm thử đáng chú ý bao gồm: chẩn đoán Reading theo dạng câu và confidence, transcript Listening sau khi nộp, khôi phục deadline sau reload, lưu hai bài Viết riêng, lưu bản ghi Nói khi chuyển phần, chống mất đáp án giữa hai tab, giữ localStorage hỏng, từ chối micro, backup không hợp lệ, bảo vệ HTTP headers, CSP không dùng eval, web app manifest, 404 thật, custom cursor, mobile 390 px và trang kết quả đề đủ cấu trúc.</w:t>
+      </w:r>
+    </w:p>
+    <w:p>
+      <w:r>
+        <w:rPr>
+          <w:rFonts w:ascii="Arial" w:hAnsi="Arial" w:eastAsia="Arial"/>
+          <w:color w:val="211D20"/>
+          <w:sz w:val="20"/>
+        </w:rPr>
+        <w:t xml:space="preserve">Sau khi tắt prefetch ở menu cố định và chuyển schema client sang </w:t>
+      </w:r>
+      <w:r>
+        <w:rPr>
+          <w:rFonts w:ascii="Consolas" w:hAnsi="Consolas" w:eastAsia="Consolas"/>
+          <w:color w:val="4A3B42"/>
+          <w:sz w:val="19"/>
+        </w:rPr>
+        <w:t>zod/mini</w:t>
+      </w:r>
+      <w:r>
+        <w:rPr>
+          <w:rFonts w:ascii="Arial" w:hAnsi="Arial" w:eastAsia="Arial"/>
+          <w:color w:val="211D20"/>
+          <w:sz w:val="20"/>
+        </w:rPr>
+        <w:t xml:space="preserve">, ba phép đo Lighthouse mobile trên production local cho thấy payload ban đầu giảm khoảng 516 xuống 376 KiB, JavaScript giảm 354 xuống 218 KiB và JavaScript chưa dùng giảm 169 xuống 26 KiB. Accessibility và Best Practices đạt 100; điểm Performance dao động 73–84 theo mô phỏng CPU. SEO 60 là chủ đích vì ứng dụng cá nhân đặt </w:t>
+      </w:r>
+      <w:r>
+        <w:rPr>
+          <w:rFonts w:ascii="Consolas" w:hAnsi="Consolas" w:eastAsia="Consolas"/>
+          <w:color w:val="4A3B42"/>
+          <w:sz w:val="19"/>
+        </w:rPr>
+        <w:t>noindex</w:t>
+      </w:r>
+      <w:r>
+        <w:rPr>
+          <w:rFonts w:ascii="Arial" w:hAnsi="Arial" w:eastAsia="Arial"/>
+          <w:color w:val="211D20"/>
+          <w:sz w:val="20"/>
+        </w:rPr>
+        <w:t>.</w:t>
       </w:r>
     </w:p>
     <w:p>
@@ -6700,7 +6723,7 @@
           <w:color w:val="4A3B42"/>
           <w:sz w:val="17"/>
         </w:rPr>
-        <w:t>npx playwright install chromium</w:t>
+        <w:t>npx playwright install chromium firefox webkit</w:t>
       </w:r>
     </w:p>
     <w:p>
@@ -9555,16 +9578,66 @@
           </w:p>
         </w:tc>
       </w:tr>
+      <w:tr>
+        <w:trPr>
+          <w:cantSplit/>
+        </w:trPr>
+        <w:tc>
+          <w:tcPr>
+            <w:tcW w:type="dxa" w:w="3013"/>
+            <w:vAlign w:val="center"/>
+            <w:tcMar>
+              <w:top w:w="85" w:type="dxa"/>
+              <w:start w:w="120" w:type="dxa"/>
+              <w:bottom w:w="85" w:type="dxa"/>
+              <w:end w:w="120" w:type="dxa"/>
+            </w:tcMar>
+          </w:tcPr>
+          <w:p>
+            <w:pPr>
+              <w:spacing w:after="0" w:line="264" w:lineRule="auto"/>
+            </w:pPr>
+            <w:r>
+              <w:rPr>
+                <w:rFonts w:ascii="Consolas" w:hAnsi="Consolas" w:eastAsia="Consolas"/>
+                <w:color w:val="4A3B42"/>
+                <w:sz w:val="15"/>
+              </w:rPr>
+              <w:t>7b78df6</w:t>
+            </w:r>
+          </w:p>
+        </w:tc>
+        <w:tc>
+          <w:tcPr>
+            <w:tcW w:type="dxa" w:w="6707"/>
+            <w:vAlign w:val="center"/>
+            <w:tcMar>
+              <w:top w:w="85" w:type="dxa"/>
+              <w:start w:w="120" w:type="dxa"/>
+              <w:bottom w:w="85" w:type="dxa"/>
+              <w:end w:w="120" w:type="dxa"/>
+            </w:tcMar>
+          </w:tcPr>
+          <w:p>
+            <w:pPr>
+              <w:spacing w:after="0" w:line="264" w:lineRule="auto"/>
+            </w:pPr>
+            <w:r>
+              <w:rPr>
+                <w:rFonts w:ascii="Arial" w:hAnsi="Arial" w:eastAsia="Arial"/>
+                <w:color w:val="211D20"/>
+                <w:sz w:val="16"/>
+              </w:rPr>
+              <w:t>Làm mới báo cáo và bằng chứng kiểm định production</w:t>
+            </w:r>
+          </w:p>
+        </w:tc>
+      </w:tr>
     </w:tbl>
     <w:p>
       <w:pPr>
         <w:spacing w:after="0"/>
       </w:pPr>
-    </w:p>
-    <w:p>
-      <w:r>
-        <w:br w:type="page"/>
-      </w:r>
     </w:p>
     <w:p>
       <w:pPr>

</xml_diff>

<commit_message>
docs: record multi-browser release evidence
</commit_message>
<xml_diff>
--- a/docs/Bao-cao-ban-giao-May-VSTEP.docx
+++ b/docs/Bao-cao-ban-giao-May-VSTEP.docx
@@ -4805,7 +4805,7 @@
                 <w:color w:val="4A3B42"/>
                 <w:sz w:val="15"/>
               </w:rPr>
-              <w:t>34604727728</w:t>
+              <w:t>34620804070</w:t>
             </w:r>
             <w:r>
               <w:rPr>
@@ -4821,7 +4821,7 @@
                 <w:color w:val="4A3B42"/>
                 <w:sz w:val="15"/>
               </w:rPr>
-              <w:t>7b78df6</w:t>
+              <w:t>df8e6b6</w:t>
             </w:r>
             <w:r>
               <w:rPr>
@@ -4829,7 +4829,7 @@
                 <w:color w:val="211D20"/>
                 <w:sz w:val="16"/>
               </w:rPr>
-              <w:t>; pipeline hiện cài Chromium, Firefox và WebKit</w:t>
+              <w:t>; đã chạy Chromium, Firefox và WebKit</w:t>
             </w:r>
           </w:p>
         </w:tc>
@@ -9633,6 +9633,63 @@
           </w:p>
         </w:tc>
       </w:tr>
+      <w:tr>
+        <w:trPr>
+          <w:cantSplit/>
+        </w:trPr>
+        <w:tc>
+          <w:tcPr>
+            <w:tcW w:type="dxa" w:w="3013"/>
+            <w:vAlign w:val="center"/>
+            <w:tcMar>
+              <w:top w:w="85" w:type="dxa"/>
+              <w:start w:w="120" w:type="dxa"/>
+              <w:bottom w:w="85" w:type="dxa"/>
+              <w:end w:w="120" w:type="dxa"/>
+            </w:tcMar>
+            <w:shd w:fill="FAF7F8"/>
+          </w:tcPr>
+          <w:p>
+            <w:pPr>
+              <w:spacing w:after="0" w:line="264" w:lineRule="auto"/>
+            </w:pPr>
+            <w:r>
+              <w:rPr>
+                <w:rFonts w:ascii="Consolas" w:hAnsi="Consolas" w:eastAsia="Consolas"/>
+                <w:color w:val="4A3B42"/>
+                <w:sz w:val="15"/>
+              </w:rPr>
+              <w:t>df8e6b6</w:t>
+            </w:r>
+          </w:p>
+        </w:tc>
+        <w:tc>
+          <w:tcPr>
+            <w:tcW w:type="dxa" w:w="6707"/>
+            <w:vAlign w:val="center"/>
+            <w:tcMar>
+              <w:top w:w="85" w:type="dxa"/>
+              <w:start w:w="120" w:type="dxa"/>
+              <w:bottom w:w="85" w:type="dxa"/>
+              <w:end w:w="120" w:type="dxa"/>
+            </w:tcMar>
+            <w:shd w:fill="FAF7F8"/>
+          </w:tcPr>
+          <w:p>
+            <w:pPr>
+              <w:spacing w:after="0" w:line="264" w:lineRule="auto"/>
+            </w:pPr>
+            <w:r>
+              <w:rPr>
+                <w:rFonts w:ascii="Arial" w:hAnsi="Arial" w:eastAsia="Arial"/>
+                <w:color w:val="211D20"/>
+                <w:sz w:val="16"/>
+              </w:rPr>
+              <w:t>Gia cố tương thích đa trình duyệt, manifest, CSP và tối ưu bundle</w:t>
+            </w:r>
+          </w:p>
+        </w:tc>
+      </w:tr>
     </w:tbl>
     <w:p>
       <w:pPr>

</xml_diff>

<commit_message>
docs: refresh final production evidence
</commit_message>
<xml_diff>
--- a/docs/Bao-cao-ban-giao-May-VSTEP.docx
+++ b/docs/Bao-cao-ban-giao-May-VSTEP.docx
@@ -139,7 +139,7 @@
                 <w:color w:val="211D20"/>
                 <w:sz w:val="18"/>
               </w:rPr>
-              <w:t>11/09/2026</w:t>
+              <w:t>12/09/2026</w:t>
             </w:r>
           </w:p>
         </w:tc>
@@ -193,7 +193,7 @@
                 <w:color w:val="211D20"/>
                 <w:sz w:val="18"/>
               </w:rPr>
-              <w:t>Kiểm định production Reading và Listening 11/09/2026</w:t>
+              <w:t>Kiểm định production Reading và Listening 12/09/2026</w:t>
             </w:r>
           </w:p>
         </w:tc>
@@ -443,7 +443,7 @@
           <w:color w:val="211D20"/>
           <w:sz w:val="22"/>
         </w:rPr>
-        <w:t>Bản code hiện đủ để Gùa pilot hằng ngày trên URL HTTPS hoặc local, Supabase thật đã kết nối và toàn bộ pipeline kiểm tra đang đạt. Reading và Listening có phản hồi theo dạng câu cùng độ chắc chắn; transcript chỉ mở sau khi nộp. Bộ kiểm thử production gồm 47 unit test và 27 E2E trên Chromium, Firefox, WebKit. Các điều kiện còn thiếu để nghiệm thu vận hành là login/sync trên bản host, micro và thiết bị thật, thử đồng bộ hai thiết bị cùng thẩm định học liệu bởi giáo viên VSTEP.</w:t>
+        <w:t>Bản code hiện đủ để Gùa pilot hằng ngày trên URL HTTPS hoặc local, Supabase thật đã kết nối và toàn bộ pipeline kiểm tra đang đạt. Reading và Listening có phản hồi theo dạng câu cùng độ chắc chắn; transcript chỉ mở sau khi nộp. Bộ kiểm thử production gồm 47 unit test và 30 E2E trên Chromium, Firefox, WebKit. Các điều kiện còn thiếu để nghiệm thu vận hành là login/sync trên bản host, micro và thiết bị thật, thử đồng bộ hai thiết bị cùng thẩm định học liệu bởi giáo viên VSTEP.</w:t>
       </w:r>
     </w:p>
     <w:p>
@@ -4437,7 +4437,7 @@
                 <w:color w:val="211D20"/>
                 <w:sz w:val="16"/>
               </w:rPr>
-              <w:t>27/27 đạt</w:t>
+              <w:t>30/30 đạt</w:t>
             </w:r>
           </w:p>
         </w:tc>
@@ -4463,7 +4463,7 @@
                 <w:color w:val="211D20"/>
                 <w:sz w:val="16"/>
               </w:rPr>
-              <w:t>25 ca Chromium; smoke Reading/Listening trên Firefox và WebKit, CSP, manifest và responsive</w:t>
+              <w:t>26 ca Chromium; 2 Firefox; 2 WebKit; crawl 8 bài ưu tiên, backup, CSP và responsive</w:t>
             </w:r>
           </w:p>
         </w:tc>
@@ -4714,7 +4714,7 @@
                 <w:color w:val="211D20"/>
                 <w:sz w:val="16"/>
               </w:rPr>
-              <w:t xml:space="preserve"> ngày 11/09/2026</w:t>
+              <w:t xml:space="preserve"> ngày 12/09/2026</w:t>
             </w:r>
           </w:p>
         </w:tc>
@@ -4805,7 +4805,7 @@
                 <w:color w:val="4A3B42"/>
                 <w:sz w:val="15"/>
               </w:rPr>
-              <w:t>34620804070</w:t>
+              <w:t>34666370380</w:t>
             </w:r>
             <w:r>
               <w:rPr>
@@ -4821,7 +4821,7 @@
                 <w:color w:val="4A3B42"/>
                 <w:sz w:val="15"/>
               </w:rPr>
-              <w:t>df8e6b6</w:t>
+              <w:t>f89387d</w:t>
             </w:r>
             <w:r>
               <w:rPr>
@@ -9690,6 +9690,61 @@
           </w:p>
         </w:tc>
       </w:tr>
+      <w:tr>
+        <w:trPr>
+          <w:cantSplit/>
+        </w:trPr>
+        <w:tc>
+          <w:tcPr>
+            <w:tcW w:type="dxa" w:w="3013"/>
+            <w:vAlign w:val="center"/>
+            <w:tcMar>
+              <w:top w:w="85" w:type="dxa"/>
+              <w:start w:w="120" w:type="dxa"/>
+              <w:bottom w:w="85" w:type="dxa"/>
+              <w:end w:w="120" w:type="dxa"/>
+            </w:tcMar>
+          </w:tcPr>
+          <w:p>
+            <w:pPr>
+              <w:spacing w:after="0" w:line="264" w:lineRule="auto"/>
+            </w:pPr>
+            <w:r>
+              <w:rPr>
+                <w:rFonts w:ascii="Consolas" w:hAnsi="Consolas" w:eastAsia="Consolas"/>
+                <w:color w:val="4A3B42"/>
+                <w:sz w:val="15"/>
+              </w:rPr>
+              <w:t>f89387d</w:t>
+            </w:r>
+          </w:p>
+        </w:tc>
+        <w:tc>
+          <w:tcPr>
+            <w:tcW w:type="dxa" w:w="6707"/>
+            <w:vAlign w:val="center"/>
+            <w:tcMar>
+              <w:top w:w="85" w:type="dxa"/>
+              <w:start w:w="120" w:type="dxa"/>
+              <w:bottom w:w="85" w:type="dxa"/>
+              <w:end w:w="120" w:type="dxa"/>
+            </w:tcMar>
+          </w:tcPr>
+          <w:p>
+            <w:pPr>
+              <w:spacing w:after="0" w:line="264" w:lineRule="auto"/>
+            </w:pPr>
+            <w:r>
+              <w:rPr>
+                <w:rFonts w:ascii="Arial" w:hAnsi="Arial" w:eastAsia="Arial"/>
+                <w:color w:val="211D20"/>
+                <w:sz w:val="16"/>
+              </w:rPr>
+              <w:t>Kiểm tra tám bài ưu tiên và tải backup trên cả ba browser engine</w:t>
+            </w:r>
+          </w:p>
+        </w:tc>
+      </w:tr>
     </w:tbl>
     <w:p>
       <w:pPr>

</xml_diff>

<commit_message>
docs: finalize production handover and smoke target
</commit_message>
<xml_diff>
--- a/docs/Bao-cao-ban-giao-May-VSTEP.docx
+++ b/docs/Bao-cao-ban-giao-May-VSTEP.docx
@@ -443,7 +443,7 @@
           <w:color w:val="211D20"/>
           <w:sz w:val="22"/>
         </w:rPr>
-        <w:t>Bản code hiện đủ để Gùa pilot hằng ngày trên URL HTTPS hoặc local, Supabase thật đã kết nối và toàn bộ pipeline kiểm tra đang đạt. Reading và Listening có phản hồi theo dạng câu cùng độ chắc chắn; transcript chỉ mở sau khi nộp. Bộ kiểm thử production gồm 47 unit test và 30 E2E trên Chromium, Firefox, WebKit. Các điều kiện còn thiếu để nghiệm thu vận hành là login/sync trên bản host, micro và thiết bị thật, thử đồng bộ hai thiết bị cùng thẩm định học liệu bởi giáo viên VSTEP.</w:t>
+        <w:t>Bản code hiện đủ để Gùa pilot hằng ngày trên URL HTTPS hoặc local, Supabase thật đã kết nối và toàn bộ pipeline kiểm tra đang đạt. Reading và Listening có phản hồi theo dạng câu cùng độ chắc chắn; transcript chỉ mở sau khi nộp. Lịch sử và đề đang làm được khóa theo đúng phiên bản học liệu. Bộ kiểm thử production gồm 53 unit test và 40 E2E trên Chromium, Firefox và WebKit. Migration gia cố quyền ghi cloud đã qua preflight nhưng còn chờ áp dụng trên production. Các điều kiện còn thiếu để nghiệm thu vận hành là đăng nhập và đồng bộ trên bản host, micro và thiết bị thật, thử đồng bộ hai thiết bị cùng thẩm định học liệu bởi giáo viên VSTEP.</w:t>
       </w:r>
     </w:p>
     <w:p>
@@ -630,7 +630,7 @@
           <w:color w:val="211D20"/>
           <w:sz w:val="20"/>
         </w:rPr>
-        <w:t>Mây hiện là một ứng dụng luyện VSTEP cá nhân có kế hoạch học theo ngày, thư viện luyện bốn kỹ năng, hai chế độ thi có giờ, từ vựng, ôn lỗi sai, lịch sử tiến bộ, ghi âm, sao lưu và đồng bộ Supabase thủ công. Reading/Listening đã có phản hồi theo dạng câu và độ chắc chắn; phần thi có giờ cảnh báo câu bỏ trống và chỉ mở transcript Listening sau khi hoàn thành. Giao diện đã được kiểm thử tự động ở viewport máy tính và điện thoại, chuyển sang tone hồng pastel, tối ưu cho tiếng Việt và cá nhân hóa cho Gùa. Mọi nút tương tác khai báo ngữ nghĩa rõ ràng, bộ lọc có trạng thái đọc được và ứng dụng có màn hình phục hồi cả khi lỗi ở root layout. Bản build, GitHub Actions và smoke test trên URL HTTPS pilot đã đạt; luồng Reading/Listening trọng yếu cũng đạt trên Chromium, Firefox và WebKit. Chưa có nghiệm thu trên iOS/Android thật.</w:t>
+        <w:t>Mây hiện là một ứng dụng luyện VSTEP cá nhân có kế hoạch học theo ngày, thư viện luyện bốn kỹ năng, hai chế độ thi có giờ, từ vựng, ôn lỗi sai, lịch sử tiến bộ, ghi âm, sao lưu và đồng bộ Supabase thủ công. Reading và Listening đã có phản hồi theo dạng câu và độ chắc chắn; phần thi có giờ cảnh báo câu bỏ trống và chỉ mở transcript Listening sau khi hoàn thành. Mỗi lượt học và đề đang làm lưu bản chụp học liệu có phiên bản, nên kết quả cũ không đổi khi ngân hàng câu hỏi được chỉnh sửa. Giao diện đã được kiểm thử tự động ở viewport máy tính và điện thoại, dùng tone hồng pastel, tối ưu cho tiếng Việt và cá nhân hóa cho Gùa. Bản build, GitHub Actions và smoke test trên URL HTTPS pilot đã đạt; luồng Reading và Listening trọng yếu cũng đạt trên Chromium, Firefox và WebKit. Chưa có nghiệm thu trên iOS hoặc Android thật.</w:t>
       </w:r>
     </w:p>
     <w:p>
@@ -640,7 +640,7 @@
           <w:color w:val="211D20"/>
           <w:sz w:val="20"/>
         </w:rPr>
-        <w:t>Sản phẩm đủ để Gùa pilot hằng ngày trên bản HTTPS hoặc local nhằm thu thập phản hồi thực tế. Chưa nên mô tả đây là hệ luyện thi VSTEP toàn diện đã được kiểm định hoặc đã nghiệm thu production. Nội dung đang là nội dung tự biên soạn, mới có một đề đủ cấu trúc, bài Nghe dùng giọng tổng hợp và bài Viết/Nói chưa có chấm điểm từ giáo viên hoặc AI. Bản host chưa được kiểm thử đăng nhập/sync bằng tài khoản thật, micro hoặc thiết bị thật của người học.</w:t>
+        <w:t>Sản phẩm đủ để Gùa pilot hằng ngày trên bản HTTPS hoặc local nhằm thu thập phản hồi thực tế. Chưa nên mô tả đây là hệ luyện thi VSTEP toàn diện đã được kiểm định hoặc đã nghiệm thu vận hành. Nội dung đang là nội dung tự biên soạn, mới có một đề đủ cấu trúc, bài Nghe dùng giọng tổng hợp và bài Viết hoặc Nói chưa có chấm điểm từ giáo viên hoặc AI. Bản host chưa được kiểm thử đăng nhập và đồng bộ bằng tài khoản thật, micro hoặc thiết bị thật của người học.</w:t>
       </w:r>
     </w:p>
     <w:p>
@@ -650,7 +650,7 @@
           <w:color w:val="211D20"/>
           <w:sz w:val="20"/>
         </w:rPr>
-        <w:t>Không có task dở dang trong milestone nền tảng tại mốc bàn giao. Các milestone về học liệu, đánh giá đầu vào, phản hồi Viết/Nói và vận hành production vẫn đang mở và được liệt kê tại Mục 12.</w:t>
+        <w:t>Các hạng mục kỹ thuật P0 về lịch sử học liệu, kiểm tra payload cloud, timeout mạng, backup khi lỗi và smoke test sau triển khai đã hoàn thành trong mã nguồn. Migration gia cố quyền ghi Supabase đã qua kiểm thử và preflight dữ liệu thật nhưng còn chờ chạy trên production. Nghiệm thu thiết bị thật, thẩm định học liệu, đánh giá đầu vào và phản hồi Viết hoặc Nói vẫn đang mở và được liệt kê tại Mục 12.</w:t>
       </w:r>
     </w:p>
     <w:p>
@@ -2187,6 +2187,19 @@
     </w:p>
     <w:p>
       <w:pPr>
+        <w:pStyle w:val="ListBullet"/>
+      </w:pPr>
+      <w:r>
+        <w:rPr>
+          <w:rFonts w:ascii="Arial" w:hAnsi="Arial" w:eastAsia="Arial"/>
+          <w:color w:val="211D20"/>
+          <w:sz w:val="20"/>
+        </w:rPr>
+        <w:t>Lượt học mới lưu bản chụp tiêu đề, câu hỏi, đáp án và giải thích của đúng phiên bản học liệu đã làm; sổ lỗi và lịch sử ưu tiên bản chụp này thay vì nội dung hiện tại.</w:t>
+      </w:r>
+    </w:p>
+    <w:p>
+      <w:pPr>
         <w:pStyle w:val="Heading2"/>
       </w:pPr>
       <w:r>
@@ -2261,6 +2274,32 @@
           <w:sz w:val="20"/>
         </w:rPr>
         <w:t>Audio không nằm trong JSON; từng bản ghi phải tải riêng.</w:t>
+      </w:r>
+    </w:p>
+    <w:p>
+      <w:pPr>
+        <w:pStyle w:val="ListBullet"/>
+      </w:pPr>
+      <w:r>
+        <w:rPr>
+          <w:rFonts w:ascii="Arial" w:hAnsi="Arial" w:eastAsia="Arial"/>
+          <w:color w:val="211D20"/>
+          <w:sz w:val="20"/>
+        </w:rPr>
+        <w:t>Auth và các lệnh đồng bộ cloud tự dừng sau 20 giây nếu mạng hoặc dịch vụ không phản hồi.</w:t>
+      </w:r>
+    </w:p>
+    <w:p>
+      <w:pPr>
+        <w:pStyle w:val="ListBullet"/>
+      </w:pPr>
+      <w:r>
+        <w:rPr>
+          <w:rFonts w:ascii="Arial" w:hAnsi="Arial" w:eastAsia="Arial"/>
+          <w:color w:val="211D20"/>
+          <w:sz w:val="20"/>
+        </w:rPr>
+        <w:t>Nếu cloud đã nhận dữ liệu nhưng trình duyệt không lưu được revision mới, ứng dụng tự tải backup và cảnh báo nguy cơ xung đột ở lần lưu sau.</w:t>
       </w:r>
     </w:p>
     <w:p>
@@ -3559,7 +3598,23 @@
           <w:color w:val="211D20"/>
           <w:sz w:val="20"/>
         </w:rPr>
-        <w:t xml:space="preserve">State phiên bản 1 gồm hồ sơ, lượt học, lịch ôn từ, lịch ôn lỗi, nháp, tâm trạng theo ngày, phiên thi đang chạy và thời điểm cập nhật. </w:t>
+        <w:t xml:space="preserve">State phiên bản 1 gồm hồ sơ, lượt học, lịch ôn từ, lịch ôn lỗi, nháp, tâm trạng theo ngày, phiên thi đang chạy và thời điểm cập nhật. Lượt học và phiên thi mới kèm snapshot học liệu có </w:t>
+      </w:r>
+      <w:r>
+        <w:rPr>
+          <w:rFonts w:ascii="Consolas" w:hAnsi="Consolas" w:eastAsia="Consolas"/>
+          <w:color w:val="4A3B42"/>
+          <w:sz w:val="19"/>
+        </w:rPr>
+        <w:t>version</w:t>
+      </w:r>
+      <w:r>
+        <w:rPr>
+          <w:rFonts w:ascii="Arial" w:hAnsi="Arial" w:eastAsia="Arial"/>
+          <w:color w:val="211D20"/>
+          <w:sz w:val="20"/>
+        </w:rPr>
+        <w:t xml:space="preserve">; dữ liệu cũ không có snapshot vẫn đọc được bằng nội dung phiên bản 1 để giữ tương thích. </w:t>
       </w:r>
       <w:r>
         <w:rPr>
@@ -3798,6 +3853,48 @@
           <w:color w:val="211D20"/>
           <w:sz w:val="20"/>
         </w:rPr>
+        <w:t>Preflight production cho migration gia cố xác nhận 1/1 snapshot hiện có đúng contract và snapshot lớn nhất là 350 byte.</w:t>
+      </w:r>
+    </w:p>
+    <w:p>
+      <w:pPr>
+        <w:pStyle w:val="ListBullet"/>
+      </w:pPr>
+      <w:r>
+        <w:rPr>
+          <w:rFonts w:ascii="Arial" w:hAnsi="Arial" w:eastAsia="Arial"/>
+          <w:color w:val="211D20"/>
+          <w:sz w:val="20"/>
+        </w:rPr>
+        <w:t xml:space="preserve">Migration </w:t>
+      </w:r>
+      <w:r>
+        <w:rPr>
+          <w:rFonts w:ascii="Consolas" w:hAnsi="Consolas" w:eastAsia="Consolas"/>
+          <w:color w:val="4A3B42"/>
+          <w:sz w:val="19"/>
+        </w:rPr>
+        <w:t>supabase/migrations/002_harden_snapshots.sql</w:t>
+      </w:r>
+      <w:r>
+        <w:rPr>
+          <w:rFonts w:ascii="Arial" w:hAnsi="Arial" w:eastAsia="Arial"/>
+          <w:color w:val="211D20"/>
+          <w:sz w:val="20"/>
+        </w:rPr>
+        <w:t xml:space="preserve"> cùng rollback đã sẵn sàng và đạt kiểm thử PGlite; chưa chạy trên dự án production tại thời điểm chốt báo cáo.</w:t>
+      </w:r>
+    </w:p>
+    <w:p>
+      <w:pPr>
+        <w:pStyle w:val="ListBullet"/>
+      </w:pPr>
+      <w:r>
+        <w:rPr>
+          <w:rFonts w:ascii="Arial" w:hAnsi="Arial" w:eastAsia="Arial"/>
+          <w:color w:val="211D20"/>
+          <w:sz w:val="20"/>
+        </w:rPr>
         <w:t>Chưa nghiệm thu đồng bộ trên thiết bị hoặc trình duyệt thứ hai.</w:t>
       </w:r>
     </w:p>
@@ -3869,7 +3966,55 @@
           <w:color w:val="211D20"/>
           <w:sz w:val="20"/>
         </w:rPr>
-        <w:t xml:space="preserve"> đọc/ghi snapshot của chính mình.</w:t>
+        <w:t xml:space="preserve"> đọc snapshot của chính mình. Sau khi migration 002 được áp dụng, client không còn quyền </w:t>
+      </w:r>
+      <w:r>
+        <w:rPr>
+          <w:rFonts w:ascii="Consolas" w:hAnsi="Consolas" w:eastAsia="Consolas"/>
+          <w:color w:val="4A3B42"/>
+          <w:sz w:val="19"/>
+        </w:rPr>
+        <w:t>insert</w:t>
+      </w:r>
+      <w:r>
+        <w:rPr>
+          <w:rFonts w:ascii="Arial" w:hAnsi="Arial" w:eastAsia="Arial"/>
+          <w:color w:val="211D20"/>
+          <w:sz w:val="20"/>
+        </w:rPr>
+        <w:t xml:space="preserve">, </w:t>
+      </w:r>
+      <w:r>
+        <w:rPr>
+          <w:rFonts w:ascii="Consolas" w:hAnsi="Consolas" w:eastAsia="Consolas"/>
+          <w:color w:val="4A3B42"/>
+          <w:sz w:val="19"/>
+        </w:rPr>
+        <w:t>update</w:t>
+      </w:r>
+      <w:r>
+        <w:rPr>
+          <w:rFonts w:ascii="Arial" w:hAnsi="Arial" w:eastAsia="Arial"/>
+          <w:color w:val="211D20"/>
+          <w:sz w:val="20"/>
+        </w:rPr>
+        <w:t xml:space="preserve"> hoặc </w:t>
+      </w:r>
+      <w:r>
+        <w:rPr>
+          <w:rFonts w:ascii="Consolas" w:hAnsi="Consolas" w:eastAsia="Consolas"/>
+          <w:color w:val="4A3B42"/>
+          <w:sz w:val="19"/>
+        </w:rPr>
+        <w:t>delete</w:t>
+      </w:r>
+      <w:r>
+        <w:rPr>
+          <w:rFonts w:ascii="Arial" w:hAnsi="Arial" w:eastAsia="Arial"/>
+          <w:color w:val="211D20"/>
+          <w:sz w:val="20"/>
+        </w:rPr>
+        <w:t xml:space="preserve"> trực tiếp.</w:t>
       </w:r>
     </w:p>
     <w:p>
@@ -3898,7 +4043,23 @@
           <w:color w:val="211D20"/>
           <w:sz w:val="20"/>
         </w:rPr>
-        <w:t xml:space="preserve"> kiểm tra revision và dùng advisory lock trong transaction để tránh một phiên cũ ghi đè bản mới.</w:t>
+        <w:t xml:space="preserve"> kiểm tra quyền trong </w:t>
+      </w:r>
+      <w:r>
+        <w:rPr>
+          <w:rFonts w:ascii="Consolas" w:hAnsi="Consolas" w:eastAsia="Consolas"/>
+          <w:color w:val="4A3B42"/>
+          <w:sz w:val="19"/>
+        </w:rPr>
+        <w:t>allowed_learners</w:t>
+      </w:r>
+      <w:r>
+        <w:rPr>
+          <w:rFonts w:ascii="Arial" w:hAnsi="Arial" w:eastAsia="Arial"/>
+          <w:color w:val="211D20"/>
+          <w:sz w:val="20"/>
+        </w:rPr>
+        <w:t>, kiểm tra revision và dùng advisory lock trong transaction để tránh một phiên cũ ghi đè bản mới.</w:t>
       </w:r>
     </w:p>
     <w:p>
@@ -3911,7 +4072,7 @@
           <w:color w:val="211D20"/>
           <w:sz w:val="20"/>
         </w:rPr>
-        <w:t>Payload bị giới hạn 10 MB và phải là object state version 1.</w:t>
+        <w:t>Payload bị giới hạn 10 MB và phải là object state version 1 với đúng kiểu dữ liệu ở các trường cấp cao.</w:t>
       </w:r>
     </w:p>
     <w:p>
@@ -4355,7 +4516,7 @@
                 <w:color w:val="211D20"/>
                 <w:sz w:val="16"/>
               </w:rPr>
-              <w:t>47/47 đạt</w:t>
+              <w:t>53/53 đạt</w:t>
             </w:r>
           </w:p>
         </w:tc>
@@ -4380,7 +4541,7 @@
                 <w:color w:val="211D20"/>
                 <w:sz w:val="16"/>
               </w:rPr>
-              <w:t>Logic học, confidence, chẩn đoán dạng câu, planner, lịch ôn, timer, store, speech, đề và SQL/RLS</w:t>
+              <w:t>Logic học, snapshot học liệu, draft version, planner, lịch ôn, timer, store, speech, đề và SQL/RLS</w:t>
             </w:r>
           </w:p>
         </w:tc>
@@ -4437,7 +4598,7 @@
                 <w:color w:val="211D20"/>
                 <w:sz w:val="16"/>
               </w:rPr>
-              <w:t>30/30 đạt</w:t>
+              <w:t>40/40 đạt</w:t>
             </w:r>
           </w:p>
         </w:tc>
@@ -4463,7 +4624,7 @@
                 <w:color w:val="211D20"/>
                 <w:sz w:val="16"/>
               </w:rPr>
-              <w:t>26 ca Chromium; 2 Firefox; 2 WebKit; crawl 8 bài ưu tiên, backup, CSP và responsive</w:t>
+              <w:t>36 ca Chromium; 2 Firefox; 2 WebKit; Reading, Listening, cloud resilience, backup và responsive</w:t>
             </w:r>
           </w:p>
         </w:tc>
@@ -4805,7 +4966,7 @@
                 <w:color w:val="4A3B42"/>
                 <w:sz w:val="15"/>
               </w:rPr>
-              <w:t>34666370380</w:t>
+              <w:t>34687798626</w:t>
             </w:r>
             <w:r>
               <w:rPr>
@@ -4821,7 +4982,7 @@
                 <w:color w:val="4A3B42"/>
                 <w:sz w:val="15"/>
               </w:rPr>
-              <w:t>f89387d</w:t>
+              <w:t>f43fc23</w:t>
             </w:r>
             <w:r>
               <w:rPr>
@@ -4905,7 +5066,7 @@
           <w:color w:val="211D20"/>
           <w:sz w:val="20"/>
         </w:rPr>
-        <w:t>Các kiểm thử đáng chú ý bao gồm: chẩn đoán Reading theo dạng câu và confidence, transcript Listening sau khi nộp, khôi phục deadline sau reload, lưu hai bài Viết riêng, lưu bản ghi Nói khi chuyển phần, chống mất đáp án giữa hai tab, giữ localStorage hỏng, từ chối micro, backup không hợp lệ, bảo vệ HTTP headers, CSP không dùng eval, web app manifest, 404 thật, custom cursor, mobile 390 px và trang kết quả đề đủ cấu trúc.</w:t>
+        <w:t>Các kiểm thử đáng chú ý bao gồm: chẩn đoán Reading theo dạng câu và confidence, transcript Listening sau khi nộp, giữ nguyên kết quả cũ khi học liệu thay đổi, bỏ draft sai phiên bản, chấm đề đang làm theo snapshot đã khóa, timeout đăng nhập cloud, lỗi lưu revision, khôi phục deadline sau reload, lưu hai bài Viết riêng, lưu bản ghi Nói khi chuyển phần, chống mất đáp án giữa hai tab, giữ localStorage hỏng, từ chối micro, backup không hợp lệ, bảo vệ HTTP headers, CSP không dùng eval, web app manifest, 404 thật, custom cursor, mobile 390 px và trang kết quả đề đủ cấu trúc.</w:t>
       </w:r>
     </w:p>
     <w:p>
@@ -6550,6 +6711,22 @@
           <w:color w:val="211D20"/>
           <w:sz w:val="20"/>
         </w:rPr>
+        <w:t xml:space="preserve">, sau đó </w:t>
+      </w:r>
+      <w:r>
+        <w:rPr>
+          <w:rFonts w:ascii="Consolas" w:hAnsi="Consolas" w:eastAsia="Consolas"/>
+          <w:color w:val="4A3B42"/>
+          <w:sz w:val="19"/>
+        </w:rPr>
+        <w:t>supabase/migrations/002_harden_snapshots.sql</w:t>
+      </w:r>
+      <w:r>
+        <w:rPr>
+          <w:rFonts w:ascii="Arial" w:hAnsi="Arial" w:eastAsia="Arial"/>
+          <w:color w:val="211D20"/>
+          <w:sz w:val="20"/>
+        </w:rPr>
         <w:t xml:space="preserve"> trong SQL Editor của dự án mới nếu cần dựng lại.</w:t>
       </w:r>
     </w:p>
@@ -7245,7 +7422,7 @@
           <w:color w:val="211D20"/>
           <w:sz w:val="20"/>
         </w:rPr>
-        <w:t>Hoàn tất nghiệm thu bản HTTPS.</w:t>
+        <w:t>Áp dụng migration gia cố Supabase.</w:t>
       </w:r>
       <w:r>
         <w:rPr>
@@ -7253,7 +7430,7 @@
           <w:color w:val="211D20"/>
           <w:sz w:val="20"/>
         </w:rPr>
-        <w:t xml:space="preserve"> Vercel pilot, biến môi trường, headers, 404 và font đã kiểm tra. Còn đăng nhập/sync bằng tài khoản thật, micro và kiểm tra không có secret trong bundle ngoài publishable key.</w:t>
+        <w:t xml:space="preserve"> Chạy migration 002 đã preflight, sau đó kiểm tra đọc snapshot, lưu revision mới và từ chối ghi trực tiếp.</w:t>
       </w:r>
     </w:p>
     <w:p>
@@ -7276,7 +7453,7 @@
           <w:color w:val="211D20"/>
           <w:sz w:val="20"/>
         </w:rPr>
-        <w:t>Nghiệm thu trên thiết bị của Gùa.</w:t>
+        <w:t>Hoàn tất nghiệm thu bản HTTPS.</w:t>
       </w:r>
       <w:r>
         <w:rPr>
@@ -7284,7 +7461,7 @@
           <w:color w:val="211D20"/>
           <w:sz w:val="20"/>
         </w:rPr>
-        <w:t xml:space="preserve"> Thử iPhone/Safari hoặc Android/Chrome thực tế, máy tính chính, tai nghe, micro, speech synthesis, reload giữa bài và màn hình tắt. Tiêu chí đạt: hoàn thành một bài Nói, một bài Nghe, một mini exam và tải lại không mất dữ liệu.</w:t>
+        <w:t xml:space="preserve"> Vercel pilot, biến môi trường, headers, 404, font và smoke tự động đã kiểm tra. Còn đăng nhập và đồng bộ bằng tài khoản thật, micro và kiểm tra bundle không chứa secret ngoài publishable key.</w:t>
       </w:r>
     </w:p>
     <w:p>
@@ -7307,7 +7484,7 @@
           <w:color w:val="211D20"/>
           <w:sz w:val="20"/>
         </w:rPr>
-        <w:t>Kiểm thử đồng bộ hai thiết bị.</w:t>
+        <w:t>Nghiệm thu trên thiết bị của Gùa.</w:t>
       </w:r>
       <w:r>
         <w:rPr>
@@ -7315,7 +7492,7 @@
           <w:color w:val="211D20"/>
           <w:sz w:val="20"/>
         </w:rPr>
-        <w:t xml:space="preserve"> Lưu từ thiết bị A, tải ở B, học thêm ở B, lưu lại và tải về A. Cố tình tạo conflict để xác nhận thông báo và quy trình backup dễ hiểu.</w:t>
+        <w:t xml:space="preserve"> Thử iPhone hoặc Safari hay Android hoặc Chrome thực tế, máy tính chính, tai nghe, micro, speech synthesis, reload giữa bài và màn hình tắt. Tiêu chí đạt là hoàn thành một bài Nói, một bài Nghe, một mini exam và tải lại không mất dữ liệu.</w:t>
       </w:r>
     </w:p>
     <w:p>
@@ -7330,6 +7507,37 @@
           <w:sz w:val="20"/>
         </w:rPr>
         <w:t xml:space="preserve">4. </w:t>
+      </w:r>
+      <w:r>
+        <w:rPr>
+          <w:rFonts w:ascii="Arial" w:hAnsi="Arial" w:eastAsia="Arial"/>
+          <w:b/>
+          <w:color w:val="211D20"/>
+          <w:sz w:val="20"/>
+        </w:rPr>
+        <w:t>Kiểm thử đồng bộ hai thiết bị.</w:t>
+      </w:r>
+      <w:r>
+        <w:rPr>
+          <w:rFonts w:ascii="Arial" w:hAnsi="Arial" w:eastAsia="Arial"/>
+          <w:color w:val="211D20"/>
+          <w:sz w:val="20"/>
+        </w:rPr>
+        <w:t xml:space="preserve"> Lưu từ thiết bị A, tải ở B, học thêm ở B, lưu lại và tải về A. Cố tình tạo conflict để xác nhận thông báo và quy trình backup dễ hiểu.</w:t>
+      </w:r>
+    </w:p>
+    <w:p>
+      <w:pPr>
+        <w:spacing w:after="80"/>
+        <w:ind w:left="351" w:hanging="238"/>
+      </w:pPr>
+      <w:r>
+        <w:rPr>
+          <w:rFonts w:ascii="Arial" w:hAnsi="Arial" w:eastAsia="Arial"/>
+          <w:color w:val="211D20"/>
+          <w:sz w:val="20"/>
+        </w:rPr>
+        <w:t xml:space="preserve">5. </w:t>
       </w:r>
       <w:r>
         <w:rPr>
@@ -8409,7 +8617,119 @@
                 <w:color w:val="211D20"/>
                 <w:sz w:val="16"/>
               </w:rPr>
-              <w:t>Bảng, RLS và RPC snapshot</w:t>
+              <w:t>Bảng, RLS và RPC snapshot nền tảng</w:t>
+            </w:r>
+          </w:p>
+        </w:tc>
+      </w:tr>
+      <w:tr>
+        <w:trPr>
+          <w:cantSplit/>
+        </w:trPr>
+        <w:tc>
+          <w:tcPr>
+            <w:tcW w:type="dxa" w:w="3013"/>
+            <w:vAlign w:val="center"/>
+            <w:tcMar>
+              <w:top w:w="85" w:type="dxa"/>
+              <w:start w:w="120" w:type="dxa"/>
+              <w:bottom w:w="85" w:type="dxa"/>
+              <w:end w:w="120" w:type="dxa"/>
+            </w:tcMar>
+            <w:shd w:fill="FAF7F8"/>
+          </w:tcPr>
+          <w:p>
+            <w:pPr>
+              <w:spacing w:after="0" w:line="264" w:lineRule="auto"/>
+            </w:pPr>
+            <w:r>
+              <w:rPr>
+                <w:rFonts w:ascii="Consolas" w:hAnsi="Consolas" w:eastAsia="Consolas"/>
+                <w:color w:val="4A3B42"/>
+                <w:sz w:val="15"/>
+              </w:rPr>
+              <w:t>supabase/migrations/002_harden_snapshots.sql</w:t>
+            </w:r>
+          </w:p>
+        </w:tc>
+        <w:tc>
+          <w:tcPr>
+            <w:tcW w:type="dxa" w:w="6707"/>
+            <w:vAlign w:val="center"/>
+            <w:tcMar>
+              <w:top w:w="85" w:type="dxa"/>
+              <w:start w:w="120" w:type="dxa"/>
+              <w:bottom w:w="85" w:type="dxa"/>
+              <w:end w:w="120" w:type="dxa"/>
+            </w:tcMar>
+            <w:shd w:fill="FAF7F8"/>
+          </w:tcPr>
+          <w:p>
+            <w:pPr>
+              <w:spacing w:after="0" w:line="264" w:lineRule="auto"/>
+            </w:pPr>
+            <w:r>
+              <w:rPr>
+                <w:rFonts w:ascii="Arial" w:hAnsi="Arial" w:eastAsia="Arial"/>
+                <w:color w:val="211D20"/>
+                <w:sz w:val="16"/>
+              </w:rPr>
+              <w:t>Contract payload, thu hồi direct DML và RPC khóa revision</w:t>
+            </w:r>
+          </w:p>
+        </w:tc>
+      </w:tr>
+      <w:tr>
+        <w:trPr>
+          <w:cantSplit/>
+        </w:trPr>
+        <w:tc>
+          <w:tcPr>
+            <w:tcW w:type="dxa" w:w="3013"/>
+            <w:vAlign w:val="center"/>
+            <w:tcMar>
+              <w:top w:w="85" w:type="dxa"/>
+              <w:start w:w="120" w:type="dxa"/>
+              <w:bottom w:w="85" w:type="dxa"/>
+              <w:end w:w="120" w:type="dxa"/>
+            </w:tcMar>
+          </w:tcPr>
+          <w:p>
+            <w:pPr>
+              <w:spacing w:after="0" w:line="264" w:lineRule="auto"/>
+            </w:pPr>
+            <w:r>
+              <w:rPr>
+                <w:rFonts w:ascii="Consolas" w:hAnsi="Consolas" w:eastAsia="Consolas"/>
+                <w:color w:val="4A3B42"/>
+                <w:sz w:val="15"/>
+              </w:rPr>
+              <w:t>supabase/rollback/002_harden_snapshots.sql</w:t>
+            </w:r>
+          </w:p>
+        </w:tc>
+        <w:tc>
+          <w:tcPr>
+            <w:tcW w:type="dxa" w:w="6707"/>
+            <w:vAlign w:val="center"/>
+            <w:tcMar>
+              <w:top w:w="85" w:type="dxa"/>
+              <w:start w:w="120" w:type="dxa"/>
+              <w:bottom w:w="85" w:type="dxa"/>
+              <w:end w:w="120" w:type="dxa"/>
+            </w:tcMar>
+          </w:tcPr>
+          <w:p>
+            <w:pPr>
+              <w:spacing w:after="0" w:line="264" w:lineRule="auto"/>
+            </w:pPr>
+            <w:r>
+              <w:rPr>
+                <w:rFonts w:ascii="Arial" w:hAnsi="Arial" w:eastAsia="Arial"/>
+                <w:color w:val="211D20"/>
+                <w:sz w:val="16"/>
+              </w:rPr>
+              <w:t>Rollback khẩn cấp có chủ đích cho migration 002</w:t>
             </w:r>
           </w:p>
         </w:tc>
@@ -8833,6 +9153,19 @@
           <w:sz w:val="20"/>
         </w:rPr>
         <w:t>[x] Supabase migration, RLS, Auth và đồng bộ một thiết bị đã kiểm tra.</w:t>
+      </w:r>
+    </w:p>
+    <w:p>
+      <w:pPr>
+        <w:pStyle w:val="ListBullet"/>
+      </w:pPr>
+      <w:r>
+        <w:rPr>
+          <w:rFonts w:ascii="Arial" w:hAnsi="Arial" w:eastAsia="Arial"/>
+          <w:color w:val="211D20"/>
+          <w:sz w:val="20"/>
+        </w:rPr>
+        <w:t>[ ] Migration gia cố 002 đã preflight nhưng chưa áp dụng trên production.</w:t>
       </w:r>
     </w:p>
     <w:p>
@@ -9745,6 +10078,63 @@
           </w:p>
         </w:tc>
       </w:tr>
+      <w:tr>
+        <w:trPr>
+          <w:cantSplit/>
+        </w:trPr>
+        <w:tc>
+          <w:tcPr>
+            <w:tcW w:type="dxa" w:w="3013"/>
+            <w:vAlign w:val="center"/>
+            <w:tcMar>
+              <w:top w:w="85" w:type="dxa"/>
+              <w:start w:w="120" w:type="dxa"/>
+              <w:bottom w:w="85" w:type="dxa"/>
+              <w:end w:w="120" w:type="dxa"/>
+            </w:tcMar>
+            <w:shd w:fill="FAF7F8"/>
+          </w:tcPr>
+          <w:p>
+            <w:pPr>
+              <w:spacing w:after="0" w:line="264" w:lineRule="auto"/>
+            </w:pPr>
+            <w:r>
+              <w:rPr>
+                <w:rFonts w:ascii="Consolas" w:hAnsi="Consolas" w:eastAsia="Consolas"/>
+                <w:color w:val="4A3B42"/>
+                <w:sz w:val="15"/>
+              </w:rPr>
+              <w:t>f43fc23</w:t>
+            </w:r>
+          </w:p>
+        </w:tc>
+        <w:tc>
+          <w:tcPr>
+            <w:tcW w:type="dxa" w:w="6707"/>
+            <w:vAlign w:val="center"/>
+            <w:tcMar>
+              <w:top w:w="85" w:type="dxa"/>
+              <w:start w:w="120" w:type="dxa"/>
+              <w:bottom w:w="85" w:type="dxa"/>
+              <w:end w:w="120" w:type="dxa"/>
+            </w:tcMar>
+            <w:shd w:fill="FAF7F8"/>
+          </w:tcPr>
+          <w:p>
+            <w:pPr>
+              <w:spacing w:after="0" w:line="264" w:lineRule="auto"/>
+            </w:pPr>
+            <w:r>
+              <w:rPr>
+                <w:rFonts w:ascii="Arial" w:hAnsi="Arial" w:eastAsia="Arial"/>
+                <w:color w:val="211D20"/>
+                <w:sz w:val="16"/>
+              </w:rPr>
+              <w:t>Version hóa lịch sử học, gia cố cloud và thêm smoke test sau deployment</w:t>
+            </w:r>
+          </w:p>
+        </w:tc>
+      </w:tr>
     </w:tbl>
     <w:p>
       <w:pPr>
@@ -10202,7 +10592,7 @@
                 <w:color w:val="211D20"/>
                 <w:sz w:val="16"/>
               </w:rPr>
-              <w:t>Cần giáo viên VSTEP review và version hóa content</w:t>
+              <w:t>Đã version hóa dữ liệu; cần giáo viên VSTEP review nội dung</w:t>
             </w:r>
           </w:p>
         </w:tc>
@@ -10416,112 +10806,6 @@
           <w:sz w:val="20"/>
         </w:rPr>
         <w:t xml:space="preserve"> làm bằng chứng kỹ thuật và báo cáo này làm tài liệu bàn giao phạm vi. Không dùng số câu đã học hoặc chuỗi ngày như bằng chứng người học đã đạt bậc VSTEP.</w:t>
-      </w:r>
-    </w:p>
-    <w:p>
-      <w:r>
-        <w:rPr>
-          <w:rFonts w:ascii="Arial" w:hAnsi="Arial" w:eastAsia="Arial"/>
-          <w:color w:val="211D20"/>
-          <w:sz w:val="20"/>
-        </w:rPr>
-        <w:t xml:space="preserve">Tài liệu liên quan: </w:t>
-      </w:r>
-      <w:r>
-        <w:rPr>
-          <w:rFonts w:ascii="Consolas" w:hAnsi="Consolas" w:eastAsia="Consolas"/>
-          <w:color w:val="4A3B42"/>
-          <w:sz w:val="19"/>
-        </w:rPr>
-        <w:t>README.md</w:t>
-      </w:r>
-      <w:r>
-        <w:rPr>
-          <w:rFonts w:ascii="Arial" w:hAnsi="Arial" w:eastAsia="Arial"/>
-          <w:color w:val="211D20"/>
-          <w:sz w:val="20"/>
-        </w:rPr>
-        <w:t xml:space="preserve">, </w:t>
-      </w:r>
-      <w:r>
-        <w:rPr>
-          <w:rFonts w:ascii="Consolas" w:hAnsi="Consolas" w:eastAsia="Consolas"/>
-          <w:color w:val="4A3B42"/>
-          <w:sz w:val="19"/>
-        </w:rPr>
-        <w:t>docs/PRODUCT.md</w:t>
-      </w:r>
-      <w:r>
-        <w:rPr>
-          <w:rFonts w:ascii="Arial" w:hAnsi="Arial" w:eastAsia="Arial"/>
-          <w:color w:val="211D20"/>
-          <w:sz w:val="20"/>
-        </w:rPr>
-        <w:t xml:space="preserve">, </w:t>
-      </w:r>
-      <w:r>
-        <w:rPr>
-          <w:rFonts w:ascii="Consolas" w:hAnsi="Consolas" w:eastAsia="Consolas"/>
-          <w:color w:val="4A3B42"/>
-          <w:sz w:val="19"/>
-        </w:rPr>
-        <w:t>docs/QUALITY.md</w:t>
-      </w:r>
-      <w:r>
-        <w:rPr>
-          <w:rFonts w:ascii="Arial" w:hAnsi="Arial" w:eastAsia="Arial"/>
-          <w:color w:val="211D20"/>
-          <w:sz w:val="20"/>
-        </w:rPr>
-        <w:t xml:space="preserve">, </w:t>
-      </w:r>
-      <w:r>
-        <w:rPr>
-          <w:rFonts w:ascii="Consolas" w:hAnsi="Consolas" w:eastAsia="Consolas"/>
-          <w:color w:val="4A3B42"/>
-          <w:sz w:val="19"/>
-        </w:rPr>
-        <w:t>docs/STATUS.md</w:t>
-      </w:r>
-      <w:r>
-        <w:rPr>
-          <w:rFonts w:ascii="Arial" w:hAnsi="Arial" w:eastAsia="Arial"/>
-          <w:color w:val="211D20"/>
-          <w:sz w:val="20"/>
-        </w:rPr>
-        <w:t xml:space="preserve">, </w:t>
-      </w:r>
-      <w:r>
-        <w:rPr>
-          <w:rFonts w:ascii="Consolas" w:hAnsi="Consolas" w:eastAsia="Consolas"/>
-          <w:color w:val="4A3B42"/>
-          <w:sz w:val="19"/>
-        </w:rPr>
-        <w:t>docs/REVIEW-RESPONSE.md</w:t>
-      </w:r>
-      <w:r>
-        <w:rPr>
-          <w:rFonts w:ascii="Arial" w:hAnsi="Arial" w:eastAsia="Arial"/>
-          <w:color w:val="211D20"/>
-          <w:sz w:val="20"/>
-        </w:rPr>
-        <w:t xml:space="preserve"> và migration tại </w:t>
-      </w:r>
-      <w:r>
-        <w:rPr>
-          <w:rFonts w:ascii="Consolas" w:hAnsi="Consolas" w:eastAsia="Consolas"/>
-          <w:color w:val="4A3B42"/>
-          <w:sz w:val="19"/>
-        </w:rPr>
-        <w:t>supabase/migrations/001_personal_study.sql</w:t>
-      </w:r>
-      <w:r>
-        <w:rPr>
-          <w:rFonts w:ascii="Arial" w:hAnsi="Arial" w:eastAsia="Arial"/>
-          <w:color w:val="211D20"/>
-          <w:sz w:val="20"/>
-        </w:rPr>
-        <w:t>.</w:t>
       </w:r>
     </w:p>
     <w:sectPr>

</xml_diff>